<commit_message>
Add architecture diagrams to Word documentation
</commit_message>
<xml_diff>
--- a/Cooking_Recipe_Assistant_Documentation.docx
+++ b/Cooking_Recipe_Assistant_Documentation.docx
@@ -57,7 +57,7 @@
         <w:rPr>
           <w:sz w:val="20"/>
         </w:rPr>
-        <w:t>Technology Stack: Python | Flask | Groq LLM | ChromaDB | Sentence Transformers | HTML/CSS/JS</w:t>
+        <w:t>Tech Stack: Python | Flask | Groq LLM | ChromaDB | Sentence Transformers | HTML/CSS/JS</w:t>
       </w:r>
     </w:p>
     <w:p>
@@ -86,7 +86,7 @@
         <w:spacing w:after="40"/>
       </w:pPr>
       <w:r>
-        <w:t>2. Architecture Overview</w:t>
+        <w:t>2. Architecture Overview (with Diagram)</w:t>
       </w:r>
     </w:p>
     <w:p>
@@ -94,7 +94,7 @@
         <w:spacing w:after="40"/>
       </w:pPr>
       <w:r>
-        <w:t>3. Hybrid Search Architecture</w:t>
+        <w:t>3. Hybrid Search Architecture (with Diagram)</w:t>
       </w:r>
     </w:p>
     <w:p>
@@ -102,7 +102,7 @@
         <w:spacing w:after="40"/>
       </w:pPr>
       <w:r>
-        <w:t>4. Project Structure</w:t>
+        <w:t>4. Agentic Tool-Calling Loop (with Diagram)</w:t>
       </w:r>
     </w:p>
     <w:p>
@@ -110,7 +110,7 @@
         <w:spacing w:after="40"/>
       </w:pPr>
       <w:r>
-        <w:t>5. Component &amp; Module Breakdown</w:t>
+        <w:t>5. Project Structure</w:t>
       </w:r>
     </w:p>
     <w:p>
@@ -118,7 +118,7 @@
         <w:spacing w:after="40"/>
       </w:pPr>
       <w:r>
-        <w:t>6. API Endpoints</w:t>
+        <w:t>6. Component &amp; Module Breakdown</w:t>
       </w:r>
     </w:p>
     <w:p>
@@ -126,7 +126,7 @@
         <w:spacing w:after="40"/>
       </w:pPr>
       <w:r>
-        <w:t>7. Setup &amp; Installation Guide</w:t>
+        <w:t>7. API Endpoints</w:t>
       </w:r>
     </w:p>
     <w:p>
@@ -134,7 +134,7 @@
         <w:spacing w:after="40"/>
       </w:pPr>
       <w:r>
-        <w:t>8. Environment Variables &amp; Configuration</w:t>
+        <w:t>8. Setup &amp; Installation Guide</w:t>
       </w:r>
     </w:p>
     <w:p>
@@ -142,7 +142,7 @@
         <w:spacing w:after="40"/>
       </w:pPr>
       <w:r>
-        <w:t>9. Usage Instructions &amp; Examples</w:t>
+        <w:t>9. Environment Variables &amp; Configuration</w:t>
       </w:r>
     </w:p>
     <w:p>
@@ -150,7 +150,7 @@
         <w:spacing w:after="40"/>
       </w:pPr>
       <w:r>
-        <w:t>10. Testing Strategy &amp; Coverage</w:t>
+        <w:t>10. Usage Instructions &amp; Examples</w:t>
       </w:r>
     </w:p>
     <w:p>
@@ -158,7 +158,7 @@
         <w:spacing w:after="40"/>
       </w:pPr>
       <w:r>
-        <w:t>11. User Flows &amp; Use Cases</w:t>
+        <w:t>11. Testing Strategy &amp; Coverage (48 Tests)</w:t>
       </w:r>
     </w:p>
     <w:p>
@@ -166,7 +166,7 @@
         <w:spacing w:after="40"/>
       </w:pPr>
       <w:r>
-        <w:t>12. Knowledge Base Schema</w:t>
+        <w:t>12. User Flows &amp; Use Cases</w:t>
       </w:r>
     </w:p>
     <w:p>
@@ -174,7 +174,15 @@
         <w:spacing w:after="40"/>
       </w:pPr>
       <w:r>
-        <w:t>13. Technology Stack</w:t>
+        <w:t>13. Knowledge Base Schema</w:t>
+      </w:r>
+    </w:p>
+    <w:p>
+      <w:pPr>
+        <w:spacing w:after="40"/>
+      </w:pPr>
+      <w:r>
+        <w:t>14. Technology Stack</w:t>
       </w:r>
     </w:p>
     <w:p>
@@ -268,7 +276,7 @@
         <w:pStyle w:val="Heading2"/>
       </w:pPr>
       <w:r>
-        <w:t>Key Differentiator: AI Agent vs Simple Chatbot</w:t>
+        <w:t>AI Agent vs Simple Chatbot</w:t>
       </w:r>
     </w:p>
     <w:tbl>
@@ -510,6 +518,11 @@
     </w:tbl>
     <w:p/>
     <w:p>
+      <w:r>
+        <w:br w:type="page"/>
+      </w:r>
+    </w:p>
+    <w:p>
       <w:pPr>
         <w:pStyle w:val="Heading1"/>
       </w:pPr>
@@ -519,15 +532,59 @@
     </w:p>
     <w:p>
       <w:r>
-        <w:t>The application follows a layered client-server architecture augmented with an AI agent loop on the backend. The data flows through the following pipeline:</w:t>
+        <w:t>The application follows a layered client-server architecture augmented with an AI agent loop. The diagram below illustrates the complete system architecture:</w:t>
       </w:r>
     </w:p>
     <w:p>
       <w:pPr>
-        <w:pStyle w:val="IntenseQuote"/>
+        <w:jc w:val="center"/>
       </w:pPr>
       <w:r>
-        <w:t>User (Browser) → Flask Server → CookingAgent → Groq LLM → Tools → Knowledge Bases → Response</w:t>
+        <w:drawing>
+          <wp:inline xmlns:a="http://schemas.openxmlformats.org/drawingml/2006/main" xmlns:pic="http://schemas.openxmlformats.org/drawingml/2006/picture">
+            <wp:extent cx="5029200" cy="5029200"/>
+            <wp:docPr id="1" name="Picture 1"/>
+            <wp:cNvGraphicFramePr>
+              <a:graphicFrameLocks noChangeAspect="1"/>
+            </wp:cNvGraphicFramePr>
+            <a:graphic>
+              <a:graphicData uri="http://schemas.openxmlformats.org/drawingml/2006/picture">
+                <pic:pic>
+                  <pic:nvPicPr>
+                    <pic:cNvPr id="0" name="architecture.png"/>
+                    <pic:cNvPicPr/>
+                  </pic:nvPicPr>
+                  <pic:blipFill>
+                    <a:blip r:embed="rId9"/>
+                    <a:stretch>
+                      <a:fillRect/>
+                    </a:stretch>
+                  </pic:blipFill>
+                  <pic:spPr>
+                    <a:xfrm>
+                      <a:off x="0" y="0"/>
+                      <a:ext cx="5029200" cy="5029200"/>
+                    </a:xfrm>
+                    <a:prstGeom prst="rect"/>
+                  </pic:spPr>
+                </pic:pic>
+              </a:graphicData>
+            </a:graphic>
+          </wp:inline>
+        </w:drawing>
+      </w:r>
+    </w:p>
+    <w:p>
+      <w:pPr>
+        <w:jc w:val="center"/>
+      </w:pPr>
+      <w:r>
+        <w:rPr>
+          <w:i/>
+          <w:color w:val="666666"/>
+          <w:sz w:val="18"/>
+        </w:rPr>
+        <w:t>Figure 1: System Architecture — Browser → Flask → AI Agent → Triple Knowledge Base</w:t>
       </w:r>
     </w:p>
     <w:p>
@@ -535,12 +592,329 @@
         <w:pStyle w:val="Heading2"/>
       </w:pPr>
       <w:r>
-        <w:t>Data Flow</w:t>
+        <w:t>Architecture Layers</w:t>
+      </w:r>
+    </w:p>
+    <w:tbl>
+      <w:tblPr>
+        <w:tblStyle w:val="MediumShading1-Accent1"/>
+        <w:tblW w:type="auto" w:w="0"/>
+        <w:jc w:val="center"/>
+        <w:tblLook w:firstColumn="1" w:firstRow="1" w:lastColumn="0" w:lastRow="0" w:noHBand="0" w:noVBand="1" w:val="04A0"/>
+      </w:tblPr>
+      <w:tblGrid>
+        <w:gridCol w:w="2160"/>
+        <w:gridCol w:w="2160"/>
+        <w:gridCol w:w="2160"/>
+        <w:gridCol w:w="2160"/>
+      </w:tblGrid>
+      <w:tr>
+        <w:tc>
+          <w:tcPr>
+            <w:tcW w:type="dxa" w:w="2160"/>
+          </w:tcPr>
+          <w:p>
+            <w:r>
+              <w:t>Layer</w:t>
+            </w:r>
+          </w:p>
+        </w:tc>
+        <w:tc>
+          <w:tcPr>
+            <w:tcW w:type="dxa" w:w="2160"/>
+          </w:tcPr>
+          <w:p>
+            <w:r>
+              <w:t>Component</w:t>
+            </w:r>
+          </w:p>
+        </w:tc>
+        <w:tc>
+          <w:tcPr>
+            <w:tcW w:type="dxa" w:w="2160"/>
+          </w:tcPr>
+          <w:p>
+            <w:r>
+              <w:t>Technology</w:t>
+            </w:r>
+          </w:p>
+        </w:tc>
+        <w:tc>
+          <w:tcPr>
+            <w:tcW w:type="dxa" w:w="2160"/>
+          </w:tcPr>
+          <w:p>
+            <w:r>
+              <w:t>Role</w:t>
+            </w:r>
+          </w:p>
+        </w:tc>
+      </w:tr>
+      <w:tr>
+        <w:tc>
+          <w:tcPr>
+            <w:tcW w:type="dxa" w:w="2160"/>
+          </w:tcPr>
+          <w:p>
+            <w:r>
+              <w:t>Presentation</w:t>
+            </w:r>
+          </w:p>
+        </w:tc>
+        <w:tc>
+          <w:tcPr>
+            <w:tcW w:type="dxa" w:w="2160"/>
+          </w:tcPr>
+          <w:p>
+            <w:r>
+              <w:t>Web UI</w:t>
+            </w:r>
+          </w:p>
+        </w:tc>
+        <w:tc>
+          <w:tcPr>
+            <w:tcW w:type="dxa" w:w="2160"/>
+          </w:tcPr>
+          <w:p>
+            <w:r>
+              <w:t>HTML/CSS/JS</w:t>
+            </w:r>
+          </w:p>
+        </w:tc>
+        <w:tc>
+          <w:tcPr>
+            <w:tcW w:type="dxa" w:w="2160"/>
+          </w:tcPr>
+          <w:p>
+            <w:r>
+              <w:t>Chat interface, markdown rendering</w:t>
+            </w:r>
+          </w:p>
+        </w:tc>
+      </w:tr>
+      <w:tr>
+        <w:tc>
+          <w:tcPr>
+            <w:tcW w:type="dxa" w:w="2160"/>
+          </w:tcPr>
+          <w:p>
+            <w:r>
+              <w:t>API Gateway</w:t>
+            </w:r>
+          </w:p>
+        </w:tc>
+        <w:tc>
+          <w:tcPr>
+            <w:tcW w:type="dxa" w:w="2160"/>
+          </w:tcPr>
+          <w:p>
+            <w:r>
+              <w:t>Flask Server (app.py)</w:t>
+            </w:r>
+          </w:p>
+        </w:tc>
+        <w:tc>
+          <w:tcPr>
+            <w:tcW w:type="dxa" w:w="2160"/>
+          </w:tcPr>
+          <w:p>
+            <w:r>
+              <w:t>Flask</w:t>
+            </w:r>
+          </w:p>
+        </w:tc>
+        <w:tc>
+          <w:tcPr>
+            <w:tcW w:type="dxa" w:w="2160"/>
+          </w:tcPr>
+          <w:p>
+            <w:r>
+              <w:t>REST routing, session management</w:t>
+            </w:r>
+          </w:p>
+        </w:tc>
+      </w:tr>
+      <w:tr>
+        <w:tc>
+          <w:tcPr>
+            <w:tcW w:type="dxa" w:w="2160"/>
+          </w:tcPr>
+          <w:p>
+            <w:r>
+              <w:t>AI Engine</w:t>
+            </w:r>
+          </w:p>
+        </w:tc>
+        <w:tc>
+          <w:tcPr>
+            <w:tcW w:type="dxa" w:w="2160"/>
+          </w:tcPr>
+          <w:p>
+            <w:r>
+              <w:t>CookingAgent (cooking_agent.py)</w:t>
+            </w:r>
+          </w:p>
+        </w:tc>
+        <w:tc>
+          <w:tcPr>
+            <w:tcW w:type="dxa" w:w="2160"/>
+          </w:tcPr>
+          <w:p>
+            <w:r>
+              <w:t>Groq LLM</w:t>
+            </w:r>
+          </w:p>
+        </w:tc>
+        <w:tc>
+          <w:tcPr>
+            <w:tcW w:type="dxa" w:w="2160"/>
+          </w:tcPr>
+          <w:p>
+            <w:r>
+              <w:t>Agentic loop, tool orchestration</w:t>
+            </w:r>
+          </w:p>
+        </w:tc>
+      </w:tr>
+      <w:tr>
+        <w:tc>
+          <w:tcPr>
+            <w:tcW w:type="dxa" w:w="2160"/>
+          </w:tcPr>
+          <w:p>
+            <w:r>
+              <w:t>Vector Store</w:t>
+            </w:r>
+          </w:p>
+        </w:tc>
+        <w:tc>
+          <w:tcPr>
+            <w:tcW w:type="dxa" w:w="2160"/>
+          </w:tcPr>
+          <w:p>
+            <w:r>
+              <w:t>RecipeVectorStore (vector_store.py)</w:t>
+            </w:r>
+          </w:p>
+        </w:tc>
+        <w:tc>
+          <w:tcPr>
+            <w:tcW w:type="dxa" w:w="2160"/>
+          </w:tcPr>
+          <w:p>
+            <w:r>
+              <w:t>ChromaDB</w:t>
+            </w:r>
+          </w:p>
+        </w:tc>
+        <w:tc>
+          <w:tcPr>
+            <w:tcW w:type="dxa" w:w="2160"/>
+          </w:tcPr>
+          <w:p>
+            <w:r>
+              <w:t>Semantic embeddings &amp; search</w:t>
+            </w:r>
+          </w:p>
+        </w:tc>
+      </w:tr>
+      <w:tr>
+        <w:tc>
+          <w:tcPr>
+            <w:tcW w:type="dxa" w:w="2160"/>
+          </w:tcPr>
+          <w:p>
+            <w:r>
+              <w:t>Data: Local</w:t>
+            </w:r>
+          </w:p>
+        </w:tc>
+        <w:tc>
+          <w:tcPr>
+            <w:tcW w:type="dxa" w:w="2160"/>
+          </w:tcPr>
+          <w:p>
+            <w:r>
+              <w:t>recipe_knowledge_base.json</w:t>
+            </w:r>
+          </w:p>
+        </w:tc>
+        <w:tc>
+          <w:tcPr>
+            <w:tcW w:type="dxa" w:w="2160"/>
+          </w:tcPr>
+          <w:p>
+            <w:r>
+              <w:t>JSON</w:t>
+            </w:r>
+          </w:p>
+        </w:tc>
+        <w:tc>
+          <w:tcPr>
+            <w:tcW w:type="dxa" w:w="2160"/>
+          </w:tcPr>
+          <w:p>
+            <w:r>
+              <w:t>25 curated recipes</w:t>
+            </w:r>
+          </w:p>
+        </w:tc>
+      </w:tr>
+      <w:tr>
+        <w:tc>
+          <w:tcPr>
+            <w:tcW w:type="dxa" w:w="2160"/>
+          </w:tcPr>
+          <w:p>
+            <w:r>
+              <w:t>Data: Online</w:t>
+            </w:r>
+          </w:p>
+        </w:tc>
+        <w:tc>
+          <w:tcPr>
+            <w:tcW w:type="dxa" w:w="2160"/>
+          </w:tcPr>
+          <w:p>
+            <w:r>
+              <w:t>TheMealDB API</w:t>
+            </w:r>
+          </w:p>
+        </w:tc>
+        <w:tc>
+          <w:tcPr>
+            <w:tcW w:type="dxa" w:w="2160"/>
+          </w:tcPr>
+          <w:p>
+            <w:r>
+              <w:t>REST API</w:t>
+            </w:r>
+          </w:p>
+        </w:tc>
+        <w:tc>
+          <w:tcPr>
+            <w:tcW w:type="dxa" w:w="2160"/>
+          </w:tcPr>
+          <w:p>
+            <w:r>
+              <w:t>300+ online recipes</w:t>
+            </w:r>
+          </w:p>
+        </w:tc>
+      </w:tr>
+    </w:tbl>
+    <w:p/>
+    <w:p>
+      <w:pPr>
+        <w:pStyle w:val="Heading2"/>
+      </w:pPr>
+      <w:r>
+        <w:t>Data Flow (10 Steps)</w:t>
       </w:r>
     </w:p>
     <w:p>
       <w:r>
-        <w:t>1. User types a message in the browser chat UI (e.g., "I have chicken and garlic").</w:t>
+        <w:t>1. User types a message in the browser chat UI.</w:t>
       </w:r>
     </w:p>
     <w:p>
@@ -560,7 +934,7 @@
     </w:p>
     <w:p>
       <w:r>
-        <w:t>5. The LLM analyzes the query and decides which tools to call (e.g., search_recipes_hybrid).</w:t>
+        <w:t>5. The LLM analyzes the query and decides which tools to call.</w:t>
       </w:r>
     </w:p>
     <w:p>
@@ -589,11 +963,81 @@
       </w:r>
     </w:p>
     <w:p>
+      <w:r>
+        <w:br w:type="page"/>
+      </w:r>
+    </w:p>
+    <w:p>
+      <w:pPr>
+        <w:pStyle w:val="Heading1"/>
+      </w:pPr>
+      <w:r>
+        <w:t>3. Hybrid Search Architecture</w:t>
+      </w:r>
+    </w:p>
+    <w:p>
+      <w:r>
+        <w:t>The hybrid search system is the core innovation of this project. It combines three different search strategies to maximize both accuracy (no hallucination) and discovery (finding relevant recipes the user might not have thought of).</w:t>
+      </w:r>
+    </w:p>
+    <w:p>
+      <w:pPr>
+        <w:jc w:val="center"/>
+      </w:pPr>
+      <w:r>
+        <w:drawing>
+          <wp:inline xmlns:a="http://schemas.openxmlformats.org/drawingml/2006/main" xmlns:pic="http://schemas.openxmlformats.org/drawingml/2006/picture">
+            <wp:extent cx="5029200" cy="5029200"/>
+            <wp:docPr id="2" name="Picture 2"/>
+            <wp:cNvGraphicFramePr>
+              <a:graphicFrameLocks noChangeAspect="1"/>
+            </wp:cNvGraphicFramePr>
+            <a:graphic>
+              <a:graphicData uri="http://schemas.openxmlformats.org/drawingml/2006/picture">
+                <pic:pic>
+                  <pic:nvPicPr>
+                    <pic:cNvPr id="0" name="hybrid_search.png"/>
+                    <pic:cNvPicPr/>
+                  </pic:nvPicPr>
+                  <pic:blipFill>
+                    <a:blip r:embed="rId10"/>
+                    <a:stretch>
+                      <a:fillRect/>
+                    </a:stretch>
+                  </pic:blipFill>
+                  <pic:spPr>
+                    <a:xfrm>
+                      <a:off x="0" y="0"/>
+                      <a:ext cx="5029200" cy="5029200"/>
+                    </a:xfrm>
+                    <a:prstGeom prst="rect"/>
+                  </pic:spPr>
+                </pic:pic>
+              </a:graphicData>
+            </a:graphic>
+          </wp:inline>
+        </w:drawing>
+      </w:r>
+    </w:p>
+    <w:p>
+      <w:pPr>
+        <w:jc w:val="center"/>
+      </w:pPr>
+      <w:r>
+        <w:rPr>
+          <w:i/>
+          <w:color w:val="666666"/>
+          <w:sz w:val="18"/>
+        </w:rPr>
+        <w:t>Figure 2: Hybrid Search — Fuzzy Matching + Semantic Vector Search → Merged &amp; Deduplicated Results</w:t>
+      </w:r>
+    </w:p>
+    <w:p>
       <w:pPr>
         <w:pStyle w:val="Heading2"/>
       </w:pPr>
       <w:r>
-        <w:t>Architecture Layers</w:t>
+        <w:t>Search Methods Comparison</w:t>
       </w:r>
     </w:p>
     <w:tbl>
@@ -616,7 +1060,7 @@
           </w:tcPr>
           <w:p>
             <w:r>
-              <w:t>Layer</w:t>
+              <w:t>Search Method</w:t>
             </w:r>
           </w:p>
         </w:tc>
@@ -626,7 +1070,7 @@
           </w:tcPr>
           <w:p>
             <w:r>
-              <w:t>Component</w:t>
+              <w:t>Best For</w:t>
             </w:r>
           </w:p>
         </w:tc>
@@ -636,7 +1080,7 @@
           </w:tcPr>
           <w:p>
             <w:r>
-              <w:t>Technology</w:t>
+              <w:t>How It Works</w:t>
             </w:r>
           </w:p>
         </w:tc>
@@ -646,7 +1090,7 @@
           </w:tcPr>
           <w:p>
             <w:r>
-              <w:t>Role</w:t>
+              <w:t>Example Query</w:t>
             </w:r>
           </w:p>
         </w:tc>
@@ -658,7 +1102,7 @@
           </w:tcPr>
           <w:p>
             <w:r>
-              <w:t>Presentation</w:t>
+              <w:t>Fuzzy Matching</w:t>
             </w:r>
           </w:p>
         </w:tc>
@@ -668,7 +1112,7 @@
           </w:tcPr>
           <w:p>
             <w:r>
-              <w:t>Web UI</w:t>
+              <w:t>Exact ingredients</w:t>
             </w:r>
           </w:p>
         </w:tc>
@@ -678,7 +1122,7 @@
           </w:tcPr>
           <w:p>
             <w:r>
-              <w:t>HTML/CSS/JS</w:t>
+              <w:t>SequenceMatcher ratio &gt; 0.6</w:t>
             </w:r>
           </w:p>
         </w:tc>
@@ -688,7 +1132,7 @@
           </w:tcPr>
           <w:p>
             <w:r>
-              <w:t>Chat interface, markdown rendering</w:t>
+              <w:t>"chicken, garlic, rice"</w:t>
             </w:r>
           </w:p>
         </w:tc>
@@ -700,7 +1144,7 @@
           </w:tcPr>
           <w:p>
             <w:r>
-              <w:t>API Gateway</w:t>
+              <w:t>Semantic Search</w:t>
             </w:r>
           </w:p>
         </w:tc>
@@ -710,7 +1154,7 @@
           </w:tcPr>
           <w:p>
             <w:r>
-              <w:t>Flask Server (app.py)</w:t>
+              <w:t>Abstract queries</w:t>
             </w:r>
           </w:p>
         </w:tc>
@@ -720,7 +1164,7 @@
           </w:tcPr>
           <w:p>
             <w:r>
-              <w:t>Flask</w:t>
+              <w:t>all-MiniLM-L6-v2 + ChromaDB cosine similarity</w:t>
             </w:r>
           </w:p>
         </w:tc>
@@ -730,7 +1174,7 @@
           </w:tcPr>
           <w:p>
             <w:r>
-              <w:t>REST routing, session management</w:t>
+              <w:t>"comfort food for winter"</w:t>
             </w:r>
           </w:p>
         </w:tc>
@@ -742,7 +1186,7 @@
           </w:tcPr>
           <w:p>
             <w:r>
-              <w:t>AI Engine</w:t>
+              <w:t>Hybrid (Both)</w:t>
             </w:r>
           </w:p>
         </w:tc>
@@ -752,7 +1196,7 @@
           </w:tcPr>
           <w:p>
             <w:r>
-              <w:t>CookingAgent (cooking_agent.py)</w:t>
+              <w:t>Everything</w:t>
             </w:r>
           </w:p>
         </w:tc>
@@ -762,7 +1206,7 @@
           </w:tcPr>
           <w:p>
             <w:r>
-              <w:t>Groq LLM</w:t>
+              <w:t>Runs fuzzy + semantic, deduplicates</w:t>
             </w:r>
           </w:p>
         </w:tc>
@@ -772,7 +1216,7 @@
           </w:tcPr>
           <w:p>
             <w:r>
-              <w:t>Agentic loop, tool orchestration</w:t>
+              <w:t>"quick spicy dinner with chicken"</w:t>
             </w:r>
           </w:p>
         </w:tc>
@@ -784,7 +1228,7 @@
           </w:tcPr>
           <w:p>
             <w:r>
-              <w:t>Vector Store</w:t>
+              <w:t>TheMealDB API</w:t>
             </w:r>
           </w:p>
         </w:tc>
@@ -794,7 +1238,7 @@
           </w:tcPr>
           <w:p>
             <w:r>
-              <w:t>RecipeVectorStore (vector_store.py)</w:t>
+              <w:t>Broader coverage</w:t>
             </w:r>
           </w:p>
         </w:tc>
@@ -804,329 +1248,7 @@
           </w:tcPr>
           <w:p>
             <w:r>
-              <w:t>ChromaDB + SentenceTransformers</w:t>
-            </w:r>
-          </w:p>
-        </w:tc>
-        <w:tc>
-          <w:tcPr>
-            <w:tcW w:type="dxa" w:w="2160"/>
-          </w:tcPr>
-          <w:p>
-            <w:r>
-              <w:t>Semantic embeddings &amp; search</w:t>
-            </w:r>
-          </w:p>
-        </w:tc>
-      </w:tr>
-      <w:tr>
-        <w:tc>
-          <w:tcPr>
-            <w:tcW w:type="dxa" w:w="2160"/>
-          </w:tcPr>
-          <w:p>
-            <w:r>
-              <w:t>Data: Local</w:t>
-            </w:r>
-          </w:p>
-        </w:tc>
-        <w:tc>
-          <w:tcPr>
-            <w:tcW w:type="dxa" w:w="2160"/>
-          </w:tcPr>
-          <w:p>
-            <w:r>
-              <w:t>recipe_knowledge_base.json</w:t>
-            </w:r>
-          </w:p>
-        </w:tc>
-        <w:tc>
-          <w:tcPr>
-            <w:tcW w:type="dxa" w:w="2160"/>
-          </w:tcPr>
-          <w:p>
-            <w:r>
-              <w:t>JSON</w:t>
-            </w:r>
-          </w:p>
-        </w:tc>
-        <w:tc>
-          <w:tcPr>
-            <w:tcW w:type="dxa" w:w="2160"/>
-          </w:tcPr>
-          <w:p>
-            <w:r>
-              <w:t>25 curated recipes</w:t>
-            </w:r>
-          </w:p>
-        </w:tc>
-      </w:tr>
-      <w:tr>
-        <w:tc>
-          <w:tcPr>
-            <w:tcW w:type="dxa" w:w="2160"/>
-          </w:tcPr>
-          <w:p>
-            <w:r>
-              <w:t>Data: Online</w:t>
-            </w:r>
-          </w:p>
-        </w:tc>
-        <w:tc>
-          <w:tcPr>
-            <w:tcW w:type="dxa" w:w="2160"/>
-          </w:tcPr>
-          <w:p>
-            <w:r>
-              <w:t>TheMealDB API</w:t>
-            </w:r>
-          </w:p>
-        </w:tc>
-        <w:tc>
-          <w:tcPr>
-            <w:tcW w:type="dxa" w:w="2160"/>
-          </w:tcPr>
-          <w:p>
-            <w:r>
-              <w:t>REST API</w:t>
-            </w:r>
-          </w:p>
-        </w:tc>
-        <w:tc>
-          <w:tcPr>
-            <w:tcW w:type="dxa" w:w="2160"/>
-          </w:tcPr>
-          <w:p>
-            <w:r>
-              <w:t>300+ online recipes</w:t>
-            </w:r>
-          </w:p>
-        </w:tc>
-      </w:tr>
-    </w:tbl>
-    <w:p/>
-    <w:p>
-      <w:pPr>
-        <w:pStyle w:val="Heading1"/>
-      </w:pPr>
-      <w:r>
-        <w:t>3. Hybrid Search Architecture</w:t>
-      </w:r>
-    </w:p>
-    <w:p>
-      <w:r>
-        <w:t>The hybrid search system is the core innovation of this project. It combines three different search strategies to maximize both accuracy (no hallucination) and discovery (finding relevant recipes the user might not have thought of).</w:t>
-      </w:r>
-    </w:p>
-    <w:tbl>
-      <w:tblPr>
-        <w:tblStyle w:val="MediumShading1-Accent1"/>
-        <w:tblW w:type="auto" w:w="0"/>
-        <w:jc w:val="center"/>
-        <w:tblLook w:firstColumn="1" w:firstRow="1" w:lastColumn="0" w:lastRow="0" w:noHBand="0" w:noVBand="1" w:val="04A0"/>
-      </w:tblPr>
-      <w:tblGrid>
-        <w:gridCol w:w="2160"/>
-        <w:gridCol w:w="2160"/>
-        <w:gridCol w:w="2160"/>
-        <w:gridCol w:w="2160"/>
-      </w:tblGrid>
-      <w:tr>
-        <w:tc>
-          <w:tcPr>
-            <w:tcW w:type="dxa" w:w="2160"/>
-          </w:tcPr>
-          <w:p>
-            <w:r>
-              <w:t>Search Method</w:t>
-            </w:r>
-          </w:p>
-        </w:tc>
-        <w:tc>
-          <w:tcPr>
-            <w:tcW w:type="dxa" w:w="2160"/>
-          </w:tcPr>
-          <w:p>
-            <w:r>
-              <w:t>Best For</w:t>
-            </w:r>
-          </w:p>
-        </w:tc>
-        <w:tc>
-          <w:tcPr>
-            <w:tcW w:type="dxa" w:w="2160"/>
-          </w:tcPr>
-          <w:p>
-            <w:r>
-              <w:t>How It Works</w:t>
-            </w:r>
-          </w:p>
-        </w:tc>
-        <w:tc>
-          <w:tcPr>
-            <w:tcW w:type="dxa" w:w="2160"/>
-          </w:tcPr>
-          <w:p>
-            <w:r>
-              <w:t>Example Query</w:t>
-            </w:r>
-          </w:p>
-        </w:tc>
-      </w:tr>
-      <w:tr>
-        <w:tc>
-          <w:tcPr>
-            <w:tcW w:type="dxa" w:w="2160"/>
-          </w:tcPr>
-          <w:p>
-            <w:r>
-              <w:t>Fuzzy Matching</w:t>
-            </w:r>
-          </w:p>
-        </w:tc>
-        <w:tc>
-          <w:tcPr>
-            <w:tcW w:type="dxa" w:w="2160"/>
-          </w:tcPr>
-          <w:p>
-            <w:r>
-              <w:t>Exact ingredients</w:t>
-            </w:r>
-          </w:p>
-        </w:tc>
-        <w:tc>
-          <w:tcPr>
-            <w:tcW w:type="dxa" w:w="2160"/>
-          </w:tcPr>
-          <w:p>
-            <w:r>
-              <w:t>SequenceMatcher compares character strings (ratio &gt; 0.6)</w:t>
-            </w:r>
-          </w:p>
-        </w:tc>
-        <w:tc>
-          <w:tcPr>
-            <w:tcW w:type="dxa" w:w="2160"/>
-          </w:tcPr>
-          <w:p>
-            <w:r>
-              <w:t>"chicken, garlic, rice"</w:t>
-            </w:r>
-          </w:p>
-        </w:tc>
-      </w:tr>
-      <w:tr>
-        <w:tc>
-          <w:tcPr>
-            <w:tcW w:type="dxa" w:w="2160"/>
-          </w:tcPr>
-          <w:p>
-            <w:r>
-              <w:t>Semantic Search</w:t>
-            </w:r>
-          </w:p>
-        </w:tc>
-        <w:tc>
-          <w:tcPr>
-            <w:tcW w:type="dxa" w:w="2160"/>
-          </w:tcPr>
-          <w:p>
-            <w:r>
-              <w:t>Abstract/mood queries</w:t>
-            </w:r>
-          </w:p>
-        </w:tc>
-        <w:tc>
-          <w:tcPr>
-            <w:tcW w:type="dxa" w:w="2160"/>
-          </w:tcPr>
-          <w:p>
-            <w:r>
-              <w:t>AI embeddings (all-MiniLM-L6-v2) + ChromaDB cosine similarity</w:t>
-            </w:r>
-          </w:p>
-        </w:tc>
-        <w:tc>
-          <w:tcPr>
-            <w:tcW w:type="dxa" w:w="2160"/>
-          </w:tcPr>
-          <w:p>
-            <w:r>
-              <w:t>"comfort food for winter"</w:t>
-            </w:r>
-          </w:p>
-        </w:tc>
-      </w:tr>
-      <w:tr>
-        <w:tc>
-          <w:tcPr>
-            <w:tcW w:type="dxa" w:w="2160"/>
-          </w:tcPr>
-          <w:p>
-            <w:r>
-              <w:t>Hybrid (Both)</w:t>
-            </w:r>
-          </w:p>
-        </w:tc>
-        <w:tc>
-          <w:tcPr>
-            <w:tcW w:type="dxa" w:w="2160"/>
-          </w:tcPr>
-          <w:p>
-            <w:r>
-              <w:t>Everything</w:t>
-            </w:r>
-          </w:p>
-        </w:tc>
-        <w:tc>
-          <w:tcPr>
-            <w:tcW w:type="dxa" w:w="2160"/>
-          </w:tcPr>
-          <w:p>
-            <w:r>
-              <w:t>Runs fuzzy + semantic, deduplicates, merges results</w:t>
-            </w:r>
-          </w:p>
-        </w:tc>
-        <w:tc>
-          <w:tcPr>
-            <w:tcW w:type="dxa" w:w="2160"/>
-          </w:tcPr>
-          <w:p>
-            <w:r>
-              <w:t>"quick spicy dinner with chicken"</w:t>
-            </w:r>
-          </w:p>
-        </w:tc>
-      </w:tr>
-      <w:tr>
-        <w:tc>
-          <w:tcPr>
-            <w:tcW w:type="dxa" w:w="2160"/>
-          </w:tcPr>
-          <w:p>
-            <w:r>
-              <w:t>TheMealDB API</w:t>
-            </w:r>
-          </w:p>
-        </w:tc>
-        <w:tc>
-          <w:tcPr>
-            <w:tcW w:type="dxa" w:w="2160"/>
-          </w:tcPr>
-          <w:p>
-            <w:r>
-              <w:t>Broader coverage</w:t>
-            </w:r>
-          </w:p>
-        </w:tc>
-        <w:tc>
-          <w:tcPr>
-            <w:tcW w:type="dxa" w:w="2160"/>
-          </w:tcPr>
-          <w:p>
-            <w:r>
-              <w:t>HTTP filter by single ingredient</w:t>
+              <w:t>HTTP filter by ingredient</w:t>
             </w:r>
           </w:p>
         </w:tc>
@@ -1183,7 +1305,7 @@
         <w:t xml:space="preserve">Storage: </w:t>
       </w:r>
       <w:r>
-        <w:t>Persistent local storage (chroma_db/ directory)</w:t>
+        <w:t>Persistent local storage in chroma_db/ directory</w:t>
       </w:r>
     </w:p>
     <w:p>
@@ -1194,7 +1316,7 @@
         <w:t xml:space="preserve">Indexing: </w:t>
       </w:r>
       <w:r>
-        <w:t>Each recipe is embedded as a rich text document combining name, cuisine, ingredients, dietary tags, and cooking times</w:t>
+        <w:t>Each recipe embedded as rich text (name + cuisine + ingredients + tags + times)</w:t>
       </w:r>
     </w:p>
     <w:p>
@@ -1205,7 +1327,7 @@
         <w:t xml:space="preserve">Query Method: </w:t>
       </w:r>
       <w:r>
-        <w:t>Cosine similarity between query embedding and stored recipe embeddings</w:t>
+        <w:t>Cosine similarity between query embedding and recipe embeddings</w:t>
       </w:r>
     </w:p>
     <w:p>
@@ -1216,7 +1338,12 @@
         <w:t xml:space="preserve">First Run: </w:t>
       </w:r>
       <w:r>
-        <w:t>Downloads model + indexes 25 recipes (~30 seconds). Cached for subsequent runs.</w:t>
+        <w:t>Downloads model + indexes 25 recipes (~30 seconds). Cached after.</w:t>
+      </w:r>
+    </w:p>
+    <w:p>
+      <w:r>
+        <w:br w:type="page"/>
       </w:r>
     </w:p>
     <w:p>
@@ -1224,7 +1351,449 @@
         <w:pStyle w:val="Heading1"/>
       </w:pPr>
       <w:r>
-        <w:t>4. Project Structure</w:t>
+        <w:t>4. Agentic Tool-Calling Loop</w:t>
+      </w:r>
+    </w:p>
+    <w:p>
+      <w:r>
+        <w:t>The core of the AI agent is an iterative tool-calling loop. Unlike a simple chatbot that makes a single LLM call, this agent can make multiple rounds of decisions, executing tools and feeding results back to the LLM until it has enough information to answer the user.</w:t>
+      </w:r>
+    </w:p>
+    <w:p>
+      <w:pPr>
+        <w:jc w:val="center"/>
+      </w:pPr>
+      <w:r>
+        <w:drawing>
+          <wp:inline xmlns:a="http://schemas.openxmlformats.org/drawingml/2006/main" xmlns:pic="http://schemas.openxmlformats.org/drawingml/2006/picture">
+            <wp:extent cx="5029200" cy="5029200"/>
+            <wp:docPr id="3" name="Picture 3"/>
+            <wp:cNvGraphicFramePr>
+              <a:graphicFrameLocks noChangeAspect="1"/>
+            </wp:cNvGraphicFramePr>
+            <a:graphic>
+              <a:graphicData uri="http://schemas.openxmlformats.org/drawingml/2006/picture">
+                <pic:pic>
+                  <pic:nvPicPr>
+                    <pic:cNvPr id="0" name="agentic_loop.png"/>
+                    <pic:cNvPicPr/>
+                  </pic:nvPicPr>
+                  <pic:blipFill>
+                    <a:blip r:embed="rId11"/>
+                    <a:stretch>
+                      <a:fillRect/>
+                    </a:stretch>
+                  </pic:blipFill>
+                  <pic:spPr>
+                    <a:xfrm>
+                      <a:off x="0" y="0"/>
+                      <a:ext cx="5029200" cy="5029200"/>
+                    </a:xfrm>
+                    <a:prstGeom prst="rect"/>
+                  </pic:spPr>
+                </pic:pic>
+              </a:graphicData>
+            </a:graphic>
+          </wp:inline>
+        </w:drawing>
+      </w:r>
+    </w:p>
+    <w:p>
+      <w:pPr>
+        <w:jc w:val="center"/>
+      </w:pPr>
+      <w:r>
+        <w:rPr>
+          <w:i/>
+          <w:color w:val="666666"/>
+          <w:sz w:val="18"/>
+        </w:rPr>
+        <w:t>Figure 3: Agentic Tool-Calling Loop — LLM autonomously decides tools, executes them, and iterates (max 5 rounds)</w:t>
+      </w:r>
+    </w:p>
+    <w:p>
+      <w:pPr>
+        <w:pStyle w:val="Heading2"/>
+      </w:pPr>
+      <w:r>
+        <w:t>7 Agent Tools</w:t>
+      </w:r>
+    </w:p>
+    <w:tbl>
+      <w:tblPr>
+        <w:tblStyle w:val="MediumShading1-Accent1"/>
+        <w:tblW w:type="auto" w:w="0"/>
+        <w:jc w:val="center"/>
+        <w:tblLook w:firstColumn="1" w:firstRow="1" w:lastColumn="0" w:lastRow="0" w:noHBand="0" w:noVBand="1" w:val="04A0"/>
+      </w:tblPr>
+      <w:tblGrid>
+        <w:gridCol w:w="2160"/>
+        <w:gridCol w:w="2160"/>
+        <w:gridCol w:w="2160"/>
+        <w:gridCol w:w="2160"/>
+      </w:tblGrid>
+      <w:tr>
+        <w:tc>
+          <w:tcPr>
+            <w:tcW w:type="dxa" w:w="2160"/>
+          </w:tcPr>
+          <w:p>
+            <w:r>
+              <w:t>#</w:t>
+            </w:r>
+          </w:p>
+        </w:tc>
+        <w:tc>
+          <w:tcPr>
+            <w:tcW w:type="dxa" w:w="2160"/>
+          </w:tcPr>
+          <w:p>
+            <w:r>
+              <w:t>Tool Name</w:t>
+            </w:r>
+          </w:p>
+        </w:tc>
+        <w:tc>
+          <w:tcPr>
+            <w:tcW w:type="dxa" w:w="2160"/>
+          </w:tcPr>
+          <w:p>
+            <w:r>
+              <w:t>Search Method</w:t>
+            </w:r>
+          </w:p>
+        </w:tc>
+        <w:tc>
+          <w:tcPr>
+            <w:tcW w:type="dxa" w:w="2160"/>
+          </w:tcPr>
+          <w:p>
+            <w:r>
+              <w:t>Description</w:t>
+            </w:r>
+          </w:p>
+        </w:tc>
+      </w:tr>
+      <w:tr>
+        <w:tc>
+          <w:tcPr>
+            <w:tcW w:type="dxa" w:w="2160"/>
+          </w:tcPr>
+          <w:p>
+            <w:r>
+              <w:t>1</w:t>
+            </w:r>
+          </w:p>
+        </w:tc>
+        <w:tc>
+          <w:tcPr>
+            <w:tcW w:type="dxa" w:w="2160"/>
+          </w:tcPr>
+          <w:p>
+            <w:r>
+              <w:t>search_recipes_hybrid</w:t>
+            </w:r>
+          </w:p>
+        </w:tc>
+        <w:tc>
+          <w:tcPr>
+            <w:tcW w:type="dxa" w:w="2160"/>
+          </w:tcPr>
+          <w:p>
+            <w:r>
+              <w:t>Fuzzy + Semantic</w:t>
+            </w:r>
+          </w:p>
+        </w:tc>
+        <w:tc>
+          <w:tcPr>
+            <w:tcW w:type="dxa" w:w="2160"/>
+          </w:tcPr>
+          <w:p>
+            <w:r>
+              <w:t>PRIMARY tool. Combines both methods, deduplicates.</w:t>
+            </w:r>
+          </w:p>
+        </w:tc>
+      </w:tr>
+      <w:tr>
+        <w:tc>
+          <w:tcPr>
+            <w:tcW w:type="dxa" w:w="2160"/>
+          </w:tcPr>
+          <w:p>
+            <w:r>
+              <w:t>2</w:t>
+            </w:r>
+          </w:p>
+        </w:tc>
+        <w:tc>
+          <w:tcPr>
+            <w:tcW w:type="dxa" w:w="2160"/>
+          </w:tcPr>
+          <w:p>
+            <w:r>
+              <w:t>search_recipes_semantic</w:t>
+            </w:r>
+          </w:p>
+        </w:tc>
+        <w:tc>
+          <w:tcPr>
+            <w:tcW w:type="dxa" w:w="2160"/>
+          </w:tcPr>
+          <w:p>
+            <w:r>
+              <w:t>ChromaDB Vector</w:t>
+            </w:r>
+          </w:p>
+        </w:tc>
+        <w:tc>
+          <w:tcPr>
+            <w:tcW w:type="dxa" w:w="2160"/>
+          </w:tcPr>
+          <w:p>
+            <w:r>
+              <w:t>For abstract queries: "comfort food", "healthy breakfast".</w:t>
+            </w:r>
+          </w:p>
+        </w:tc>
+      </w:tr>
+      <w:tr>
+        <w:tc>
+          <w:tcPr>
+            <w:tcW w:type="dxa" w:w="2160"/>
+          </w:tcPr>
+          <w:p>
+            <w:r>
+              <w:t>3</w:t>
+            </w:r>
+          </w:p>
+        </w:tc>
+        <w:tc>
+          <w:tcPr>
+            <w:tcW w:type="dxa" w:w="2160"/>
+          </w:tcPr>
+          <w:p>
+            <w:r>
+              <w:t>search_recipes_local</w:t>
+            </w:r>
+          </w:p>
+        </w:tc>
+        <w:tc>
+          <w:tcPr>
+            <w:tcW w:type="dxa" w:w="2160"/>
+          </w:tcPr>
+          <w:p>
+            <w:r>
+              <w:t>Fuzzy String Match</w:t>
+            </w:r>
+          </w:p>
+        </w:tc>
+        <w:tc>
+          <w:tcPr>
+            <w:tcW w:type="dxa" w:w="2160"/>
+          </w:tcPr>
+          <w:p>
+            <w:r>
+              <w:t>Direct ingredient matching with SequenceMatcher.</w:t>
+            </w:r>
+          </w:p>
+        </w:tc>
+      </w:tr>
+      <w:tr>
+        <w:tc>
+          <w:tcPr>
+            <w:tcW w:type="dxa" w:w="2160"/>
+          </w:tcPr>
+          <w:p>
+            <w:r>
+              <w:t>4</w:t>
+            </w:r>
+          </w:p>
+        </w:tc>
+        <w:tc>
+          <w:tcPr>
+            <w:tcW w:type="dxa" w:w="2160"/>
+          </w:tcPr>
+          <w:p>
+            <w:r>
+              <w:t>search_recipes_api</w:t>
+            </w:r>
+          </w:p>
+        </w:tc>
+        <w:tc>
+          <w:tcPr>
+            <w:tcW w:type="dxa" w:w="2160"/>
+          </w:tcPr>
+          <w:p>
+            <w:r>
+              <w:t>TheMealDB HTTP</w:t>
+            </w:r>
+          </w:p>
+        </w:tc>
+        <w:tc>
+          <w:tcPr>
+            <w:tcW w:type="dxa" w:w="2160"/>
+          </w:tcPr>
+          <w:p>
+            <w:r>
+              <w:t>Online API search by single ingredient.</w:t>
+            </w:r>
+          </w:p>
+        </w:tc>
+      </w:tr>
+      <w:tr>
+        <w:tc>
+          <w:tcPr>
+            <w:tcW w:type="dxa" w:w="2160"/>
+          </w:tcPr>
+          <w:p>
+            <w:r>
+              <w:t>5</w:t>
+            </w:r>
+          </w:p>
+        </w:tc>
+        <w:tc>
+          <w:tcPr>
+            <w:tcW w:type="dxa" w:w="2160"/>
+          </w:tcPr>
+          <w:p>
+            <w:r>
+              <w:t>get_recipe_details_local</w:t>
+            </w:r>
+          </w:p>
+        </w:tc>
+        <w:tc>
+          <w:tcPr>
+            <w:tcW w:type="dxa" w:w="2160"/>
+          </w:tcPr>
+          <w:p>
+            <w:r>
+              <w:t>Local KB Lookup</w:t>
+            </w:r>
+          </w:p>
+        </w:tc>
+        <w:tc>
+          <w:tcPr>
+            <w:tcW w:type="dxa" w:w="2160"/>
+          </w:tcPr>
+          <w:p>
+            <w:r>
+              <w:t>Full recipe with ingredients and step-by-step instructions.</w:t>
+            </w:r>
+          </w:p>
+        </w:tc>
+      </w:tr>
+      <w:tr>
+        <w:tc>
+          <w:tcPr>
+            <w:tcW w:type="dxa" w:w="2160"/>
+          </w:tcPr>
+          <w:p>
+            <w:r>
+              <w:t>6</w:t>
+            </w:r>
+          </w:p>
+        </w:tc>
+        <w:tc>
+          <w:tcPr>
+            <w:tcW w:type="dxa" w:w="2160"/>
+          </w:tcPr>
+          <w:p>
+            <w:r>
+              <w:t>get_recipe_details_api</w:t>
+            </w:r>
+          </w:p>
+        </w:tc>
+        <w:tc>
+          <w:tcPr>
+            <w:tcW w:type="dxa" w:w="2160"/>
+          </w:tcPr>
+          <w:p>
+            <w:r>
+              <w:t>TheMealDB HTTP</w:t>
+            </w:r>
+          </w:p>
+        </w:tc>
+        <w:tc>
+          <w:tcPr>
+            <w:tcW w:type="dxa" w:w="2160"/>
+          </w:tcPr>
+          <w:p>
+            <w:r>
+              <w:t>Full recipe details from online API.</w:t>
+            </w:r>
+          </w:p>
+        </w:tc>
+      </w:tr>
+      <w:tr>
+        <w:tc>
+          <w:tcPr>
+            <w:tcW w:type="dxa" w:w="2160"/>
+          </w:tcPr>
+          <w:p>
+            <w:r>
+              <w:t>7</w:t>
+            </w:r>
+          </w:p>
+        </w:tc>
+        <w:tc>
+          <w:tcPr>
+            <w:tcW w:type="dxa" w:w="2160"/>
+          </w:tcPr>
+          <w:p>
+            <w:r>
+              <w:t>list_all_recipes</w:t>
+            </w:r>
+          </w:p>
+        </w:tc>
+        <w:tc>
+          <w:tcPr>
+            <w:tcW w:type="dxa" w:w="2160"/>
+          </w:tcPr>
+          <w:p>
+            <w:r>
+              <w:t>Local KB Dump</w:t>
+            </w:r>
+          </w:p>
+        </w:tc>
+        <w:tc>
+          <w:tcPr>
+            <w:tcW w:type="dxa" w:w="2160"/>
+          </w:tcPr>
+          <w:p>
+            <w:r>
+              <w:t>All 25 recipes grouped by category.</w:t>
+            </w:r>
+          </w:p>
+        </w:tc>
+      </w:tr>
+    </w:tbl>
+    <w:p/>
+    <w:p>
+      <w:pPr>
+        <w:pStyle w:val="Heading2"/>
+      </w:pPr>
+      <w:r>
+        <w:t>Loop Safety</w:t>
+      </w:r>
+    </w:p>
+    <w:p>
+      <w:r>
+        <w:t>The loop is capped at 5 iterations to prevent infinite loops. If the LLM keeps requesting tools after 5 rounds, the agent returns whatever text is available. Additionally, if the Groq API returns a tool_use_failed error (malformed tool call), the agent retries without tools to ensure the user always receives a response.</w:t>
+      </w:r>
+    </w:p>
+    <w:p>
+      <w:r>
+        <w:br w:type="page"/>
+      </w:r>
+    </w:p>
+    <w:p>
+      <w:pPr>
+        <w:pStyle w:val="Heading1"/>
+      </w:pPr>
+      <w:r>
+        <w:t>5. Project Structure</w:t>
       </w:r>
     </w:p>
     <w:tbl>
@@ -1299,7 +1868,7 @@
           </w:tcPr>
           <w:p>
             <w:r>
-              <w:t>Core AI Agent: Groq LLM integration, 7 tools, agentic loop, hybrid search</w:t>
+              <w:t>Core AI Agent: Groq LLM, 7 tools, agentic loop, hybrid search</w:t>
             </w:r>
           </w:p>
         </w:tc>
@@ -1321,7 +1890,7 @@
           </w:tcPr>
           <w:p>
             <w:r>
-              <w:t>ChromaDB vector database: recipe embedding, indexing, and semantic search</w:t>
+              <w:t>ChromaDB vector database: embedding, indexing, semantic search</w:t>
             </w:r>
           </w:p>
         </w:tc>
@@ -1343,7 +1912,7 @@
           </w:tcPr>
           <w:p>
             <w:r>
-              <w:t>Local recipe database with 25 curated recipes across 8 cuisines</w:t>
+              <w:t>Local recipe database with 25 curated recipes</w:t>
             </w:r>
           </w:p>
         </w:tc>
@@ -1387,7 +1956,7 @@
           </w:tcPr>
           <w:p>
             <w:r>
-              <w:t>Python package dependencies (6 packages)</w:t>
+              <w:t>Python dependencies (6 packages)</w:t>
             </w:r>
           </w:p>
         </w:tc>
@@ -1399,7 +1968,7 @@
           </w:tcPr>
           <w:p>
             <w:r>
-              <w:t>Project_Documentation.md</w:t>
+              <w:t>.env</w:t>
             </w:r>
           </w:p>
         </w:tc>
@@ -1409,7 +1978,7 @@
           </w:tcPr>
           <w:p>
             <w:r>
-              <w:t>Detailed technical documentation (10 sections)</w:t>
+              <w:t>GROQ_API_KEY (not tracked in git)</w:t>
             </w:r>
           </w:p>
         </w:tc>
@@ -1421,7 +1990,7 @@
           </w:tcPr>
           <w:p>
             <w:r>
-              <w:t>.env</w:t>
+              <w:t>templates/index.html</w:t>
             </w:r>
           </w:p>
         </w:tc>
@@ -1431,7 +2000,7 @@
           </w:tcPr>
           <w:p>
             <w:r>
-              <w:t>Environment variables - GROQ_API_KEY (not tracked in git)</w:t>
+              <w:t>Cortex-inspired chat interface</w:t>
             </w:r>
           </w:p>
         </w:tc>
@@ -1443,7 +2012,7 @@
           </w:tcPr>
           <w:p>
             <w:r>
-              <w:t>.gitignore</w:t>
+              <w:t>static/style.css</w:t>
             </w:r>
           </w:p>
         </w:tc>
@@ -1453,7 +2022,7 @@
           </w:tcPr>
           <w:p>
             <w:r>
-              <w:t>Git exclusion rules for .env, __pycache__, chroma_db/</w:t>
+              <w:t>Glassmorphism CSS styling</w:t>
             </w:r>
           </w:p>
         </w:tc>
@@ -1465,7 +2034,7 @@
           </w:tcPr>
           <w:p>
             <w:r>
-              <w:t>README.md</w:t>
+              <w:t>static/script.js</w:t>
             </w:r>
           </w:p>
         </w:tc>
@@ -1475,7 +2044,7 @@
           </w:tcPr>
           <w:p>
             <w:r>
-              <w:t>Quick-start guide and project summary</w:t>
+              <w:t>Frontend chat logic and markdown rendering</w:t>
             </w:r>
           </w:p>
         </w:tc>
@@ -1487,7 +2056,7 @@
           </w:tcPr>
           <w:p>
             <w:r>
-              <w:t>templates/index.html</w:t>
+              <w:t>diagrams/</w:t>
             </w:r>
           </w:p>
         </w:tc>
@@ -1497,51 +2066,7 @@
           </w:tcPr>
           <w:p>
             <w:r>
-              <w:t>Web UI template with Cortex-inspired chat interface</w:t>
-            </w:r>
-          </w:p>
-        </w:tc>
-      </w:tr>
-      <w:tr>
-        <w:tc>
-          <w:tcPr>
-            <w:tcW w:type="dxa" w:w="4320"/>
-          </w:tcPr>
-          <w:p>
-            <w:r>
-              <w:t>static/style.css</w:t>
-            </w:r>
-          </w:p>
-        </w:tc>
-        <w:tc>
-          <w:tcPr>
-            <w:tcW w:type="dxa" w:w="4320"/>
-          </w:tcPr>
-          <w:p>
-            <w:r>
-              <w:t>CSS with glassmorphism, animations, and responsive design</w:t>
-            </w:r>
-          </w:p>
-        </w:tc>
-      </w:tr>
-      <w:tr>
-        <w:tc>
-          <w:tcPr>
-            <w:tcW w:type="dxa" w:w="4320"/>
-          </w:tcPr>
-          <w:p>
-            <w:r>
-              <w:t>static/script.js</w:t>
-            </w:r>
-          </w:p>
-        </w:tc>
-        <w:tc>
-          <w:tcPr>
-            <w:tcW w:type="dxa" w:w="4320"/>
-          </w:tcPr>
-          <w:p>
-            <w:r>
-              <w:t>Frontend JavaScript: chat logic, markdown rendering, API calls</w:t>
+              <w:t>Architecture diagram images for documentation</w:t>
             </w:r>
           </w:p>
         </w:tc>
@@ -1553,7 +2078,7 @@
         <w:pStyle w:val="Heading1"/>
       </w:pPr>
       <w:r>
-        <w:t>5. Component &amp; Module Breakdown</w:t>
+        <w:t>6. Component &amp; Module Breakdown</w:t>
       </w:r>
     </w:p>
     <w:p>
@@ -1561,17 +2086,12 @@
         <w:pStyle w:val="Heading2"/>
       </w:pPr>
       <w:r>
-        <w:t>5.1 app.py — Flask Web Server</w:t>
+        <w:t>6.1 app.py — Flask Web Server</w:t>
       </w:r>
     </w:p>
     <w:p>
       <w:r>
-        <w:t>Role: API gateway and session manager. Serves the web UI and routes chat requests to the AI agent.</w:t>
-      </w:r>
-    </w:p>
-    <w:p>
-      <w:r>
-        <w:t>Key features:</w:t>
+        <w:t>Role: API gateway and session manager.</w:t>
       </w:r>
     </w:p>
     <w:p>
@@ -1587,7 +2107,7 @@
         <w:pStyle w:val="ListBullet"/>
       </w:pPr>
       <w:r>
-        <w:t>Input validation (empty messages, message length &gt; 2000 chars)</w:t>
+        <w:t>Input validation (empty messages, length &gt; 2000)</w:t>
       </w:r>
     </w:p>
     <w:p>
@@ -1619,389 +2139,12 @@
         <w:pStyle w:val="Heading2"/>
       </w:pPr>
       <w:r>
-        <w:t>5.2 cooking_agent.py — AI Agent</w:t>
+        <w:t>6.2 cooking_agent.py — AI Agent</w:t>
       </w:r>
     </w:p>
     <w:p>
       <w:r>
-        <w:t>Role: The brain of the application. Orchestrates the LLM, manages tools, and runs the agentic loop.</w:t>
-      </w:r>
-    </w:p>
-    <w:p>
-      <w:pPr>
-        <w:pStyle w:val="Heading3"/>
-      </w:pPr>
-      <w:r>
-        <w:t>7 Agent Tools</w:t>
-      </w:r>
-    </w:p>
-    <w:tbl>
-      <w:tblPr>
-        <w:tblStyle w:val="MediumShading1-Accent1"/>
-        <w:tblW w:type="auto" w:w="0"/>
-        <w:jc w:val="center"/>
-        <w:tblLook w:firstColumn="1" w:firstRow="1" w:lastColumn="0" w:lastRow="0" w:noHBand="0" w:noVBand="1" w:val="04A0"/>
-      </w:tblPr>
-      <w:tblGrid>
-        <w:gridCol w:w="2160"/>
-        <w:gridCol w:w="2160"/>
-        <w:gridCol w:w="2160"/>
-        <w:gridCol w:w="2160"/>
-      </w:tblGrid>
-      <w:tr>
-        <w:tc>
-          <w:tcPr>
-            <w:tcW w:type="dxa" w:w="2160"/>
-          </w:tcPr>
-          <w:p>
-            <w:r>
-              <w:t>#</w:t>
-            </w:r>
-          </w:p>
-        </w:tc>
-        <w:tc>
-          <w:tcPr>
-            <w:tcW w:type="dxa" w:w="2160"/>
-          </w:tcPr>
-          <w:p>
-            <w:r>
-              <w:t>Tool Name</w:t>
-            </w:r>
-          </w:p>
-        </w:tc>
-        <w:tc>
-          <w:tcPr>
-            <w:tcW w:type="dxa" w:w="2160"/>
-          </w:tcPr>
-          <w:p>
-            <w:r>
-              <w:t>Search Method</w:t>
-            </w:r>
-          </w:p>
-        </w:tc>
-        <w:tc>
-          <w:tcPr>
-            <w:tcW w:type="dxa" w:w="2160"/>
-          </w:tcPr>
-          <w:p>
-            <w:r>
-              <w:t>Description</w:t>
-            </w:r>
-          </w:p>
-        </w:tc>
-      </w:tr>
-      <w:tr>
-        <w:tc>
-          <w:tcPr>
-            <w:tcW w:type="dxa" w:w="2160"/>
-          </w:tcPr>
-          <w:p>
-            <w:r>
-              <w:t>1</w:t>
-            </w:r>
-          </w:p>
-        </w:tc>
-        <w:tc>
-          <w:tcPr>
-            <w:tcW w:type="dxa" w:w="2160"/>
-          </w:tcPr>
-          <w:p>
-            <w:r>
-              <w:t>search_recipes_hybrid</w:t>
-            </w:r>
-          </w:p>
-        </w:tc>
-        <w:tc>
-          <w:tcPr>
-            <w:tcW w:type="dxa" w:w="2160"/>
-          </w:tcPr>
-          <w:p>
-            <w:r>
-              <w:t>Fuzzy + Semantic</w:t>
-            </w:r>
-          </w:p>
-        </w:tc>
-        <w:tc>
-          <w:tcPr>
-            <w:tcW w:type="dxa" w:w="2160"/>
-          </w:tcPr>
-          <w:p>
-            <w:r>
-              <w:t>PRIMARY tool. Combines both search methods, deduplicates results.</w:t>
-            </w:r>
-          </w:p>
-        </w:tc>
-      </w:tr>
-      <w:tr>
-        <w:tc>
-          <w:tcPr>
-            <w:tcW w:type="dxa" w:w="2160"/>
-          </w:tcPr>
-          <w:p>
-            <w:r>
-              <w:t>2</w:t>
-            </w:r>
-          </w:p>
-        </w:tc>
-        <w:tc>
-          <w:tcPr>
-            <w:tcW w:type="dxa" w:w="2160"/>
-          </w:tcPr>
-          <w:p>
-            <w:r>
-              <w:t>search_recipes_semantic</w:t>
-            </w:r>
-          </w:p>
-        </w:tc>
-        <w:tc>
-          <w:tcPr>
-            <w:tcW w:type="dxa" w:w="2160"/>
-          </w:tcPr>
-          <w:p>
-            <w:r>
-              <w:t>ChromaDB Vector</w:t>
-            </w:r>
-          </w:p>
-        </w:tc>
-        <w:tc>
-          <w:tcPr>
-            <w:tcW w:type="dxa" w:w="2160"/>
-          </w:tcPr>
-          <w:p>
-            <w:r>
-              <w:t>For abstract queries: "comfort food", "healthy breakfast".</w:t>
-            </w:r>
-          </w:p>
-        </w:tc>
-      </w:tr>
-      <w:tr>
-        <w:tc>
-          <w:tcPr>
-            <w:tcW w:type="dxa" w:w="2160"/>
-          </w:tcPr>
-          <w:p>
-            <w:r>
-              <w:t>3</w:t>
-            </w:r>
-          </w:p>
-        </w:tc>
-        <w:tc>
-          <w:tcPr>
-            <w:tcW w:type="dxa" w:w="2160"/>
-          </w:tcPr>
-          <w:p>
-            <w:r>
-              <w:t>search_recipes_local</w:t>
-            </w:r>
-          </w:p>
-        </w:tc>
-        <w:tc>
-          <w:tcPr>
-            <w:tcW w:type="dxa" w:w="2160"/>
-          </w:tcPr>
-          <w:p>
-            <w:r>
-              <w:t>Fuzzy String Match</w:t>
-            </w:r>
-          </w:p>
-        </w:tc>
-        <w:tc>
-          <w:tcPr>
-            <w:tcW w:type="dxa" w:w="2160"/>
-          </w:tcPr>
-          <w:p>
-            <w:r>
-              <w:t>Direct ingredient matching with SequenceMatcher.</w:t>
-            </w:r>
-          </w:p>
-        </w:tc>
-      </w:tr>
-      <w:tr>
-        <w:tc>
-          <w:tcPr>
-            <w:tcW w:type="dxa" w:w="2160"/>
-          </w:tcPr>
-          <w:p>
-            <w:r>
-              <w:t>4</w:t>
-            </w:r>
-          </w:p>
-        </w:tc>
-        <w:tc>
-          <w:tcPr>
-            <w:tcW w:type="dxa" w:w="2160"/>
-          </w:tcPr>
-          <w:p>
-            <w:r>
-              <w:t>search_recipes_api</w:t>
-            </w:r>
-          </w:p>
-        </w:tc>
-        <w:tc>
-          <w:tcPr>
-            <w:tcW w:type="dxa" w:w="2160"/>
-          </w:tcPr>
-          <w:p>
-            <w:r>
-              <w:t>TheMealDB HTTP</w:t>
-            </w:r>
-          </w:p>
-        </w:tc>
-        <w:tc>
-          <w:tcPr>
-            <w:tcW w:type="dxa" w:w="2160"/>
-          </w:tcPr>
-          <w:p>
-            <w:r>
-              <w:t>Online API search by single ingredient.</w:t>
-            </w:r>
-          </w:p>
-        </w:tc>
-      </w:tr>
-      <w:tr>
-        <w:tc>
-          <w:tcPr>
-            <w:tcW w:type="dxa" w:w="2160"/>
-          </w:tcPr>
-          <w:p>
-            <w:r>
-              <w:t>5</w:t>
-            </w:r>
-          </w:p>
-        </w:tc>
-        <w:tc>
-          <w:tcPr>
-            <w:tcW w:type="dxa" w:w="2160"/>
-          </w:tcPr>
-          <w:p>
-            <w:r>
-              <w:t>get_recipe_details_local</w:t>
-            </w:r>
-          </w:p>
-        </w:tc>
-        <w:tc>
-          <w:tcPr>
-            <w:tcW w:type="dxa" w:w="2160"/>
-          </w:tcPr>
-          <w:p>
-            <w:r>
-              <w:t>Local KB Lookup</w:t>
-            </w:r>
-          </w:p>
-        </w:tc>
-        <w:tc>
-          <w:tcPr>
-            <w:tcW w:type="dxa" w:w="2160"/>
-          </w:tcPr>
-          <w:p>
-            <w:r>
-              <w:t>Full recipe with ingredients and step-by-step instructions.</w:t>
-            </w:r>
-          </w:p>
-        </w:tc>
-      </w:tr>
-      <w:tr>
-        <w:tc>
-          <w:tcPr>
-            <w:tcW w:type="dxa" w:w="2160"/>
-          </w:tcPr>
-          <w:p>
-            <w:r>
-              <w:t>6</w:t>
-            </w:r>
-          </w:p>
-        </w:tc>
-        <w:tc>
-          <w:tcPr>
-            <w:tcW w:type="dxa" w:w="2160"/>
-          </w:tcPr>
-          <w:p>
-            <w:r>
-              <w:t>get_recipe_details_api</w:t>
-            </w:r>
-          </w:p>
-        </w:tc>
-        <w:tc>
-          <w:tcPr>
-            <w:tcW w:type="dxa" w:w="2160"/>
-          </w:tcPr>
-          <w:p>
-            <w:r>
-              <w:t>TheMealDB HTTP</w:t>
-            </w:r>
-          </w:p>
-        </w:tc>
-        <w:tc>
-          <w:tcPr>
-            <w:tcW w:type="dxa" w:w="2160"/>
-          </w:tcPr>
-          <w:p>
-            <w:r>
-              <w:t>Full recipe details from online API.</w:t>
-            </w:r>
-          </w:p>
-        </w:tc>
-      </w:tr>
-      <w:tr>
-        <w:tc>
-          <w:tcPr>
-            <w:tcW w:type="dxa" w:w="2160"/>
-          </w:tcPr>
-          <w:p>
-            <w:r>
-              <w:t>7</w:t>
-            </w:r>
-          </w:p>
-        </w:tc>
-        <w:tc>
-          <w:tcPr>
-            <w:tcW w:type="dxa" w:w="2160"/>
-          </w:tcPr>
-          <w:p>
-            <w:r>
-              <w:t>list_all_recipes</w:t>
-            </w:r>
-          </w:p>
-        </w:tc>
-        <w:tc>
-          <w:tcPr>
-            <w:tcW w:type="dxa" w:w="2160"/>
-          </w:tcPr>
-          <w:p>
-            <w:r>
-              <w:t>Local KB Dump</w:t>
-            </w:r>
-          </w:p>
-        </w:tc>
-        <w:tc>
-          <w:tcPr>
-            <w:tcW w:type="dxa" w:w="2160"/>
-          </w:tcPr>
-          <w:p>
-            <w:r>
-              <w:t>All 25 recipes grouped by category.</w:t>
-            </w:r>
-          </w:p>
-        </w:tc>
-      </w:tr>
-    </w:tbl>
-    <w:p/>
-    <w:p>
-      <w:pPr>
-        <w:pStyle w:val="Heading2"/>
-      </w:pPr>
-      <w:r>
-        <w:t>5.3 vector_store.py — ChromaDB Vector Store</w:t>
-      </w:r>
-    </w:p>
-    <w:p>
-      <w:r>
-        <w:t>Role: Manages the ChromaDB vector database for semantic recipe search.</w:t>
-      </w:r>
-    </w:p>
-    <w:p>
-      <w:r>
-        <w:t>Key features:</w:t>
+        <w:t>Role: The brain. Orchestrates LLM, manages 7 tools, runs agentic loop.</w:t>
       </w:r>
     </w:p>
     <w:p>
@@ -2009,7 +2152,7 @@
         <w:pStyle w:val="ListBullet"/>
       </w:pPr>
       <w:r>
-        <w:t>Loads SentenceTransformer model (all-MiniLM-L6-v2)</w:t>
+        <w:t>Groq LLM integration (llama-3.3-70b-versatile)</w:t>
       </w:r>
     </w:p>
     <w:p>
@@ -2017,7 +2160,7 @@
         <w:pStyle w:val="ListBullet"/>
       </w:pPr>
       <w:r>
-        <w:t>Builds rich text documents from recipe metadata for embedding</w:t>
+        <w:t>Agentic tool-calling loop (max 5 iterations)</w:t>
       </w:r>
     </w:p>
     <w:p>
@@ -2025,7 +2168,7 @@
         <w:pStyle w:val="ListBullet"/>
       </w:pPr>
       <w:r>
-        <w:t>Persistent storage in chroma_db/ directory</w:t>
+        <w:t>Session-based conversation memory</w:t>
       </w:r>
     </w:p>
     <w:p>
@@ -2033,7 +2176,7 @@
         <w:pStyle w:val="ListBullet"/>
       </w:pPr>
       <w:r>
-        <w:t>Batch embedding generation for all recipes</w:t>
+        <w:t>Fuzzy string matching (SequenceMatcher)</w:t>
       </w:r>
     </w:p>
     <w:p>
@@ -2041,7 +2184,15 @@
         <w:pStyle w:val="ListBullet"/>
       </w:pPr>
       <w:r>
-        <w:t>Cosine similarity search with normalized scoring (0-100%)</w:t>
+        <w:t>Hybrid search combining fuzzy + semantic results</w:t>
+      </w:r>
+    </w:p>
+    <w:p>
+      <w:pPr>
+        <w:pStyle w:val="ListBullet"/>
+      </w:pPr>
+      <w:r>
+        <w:t>Error recovery: retries without tools on Groq 400 errors</w:t>
       </w:r>
     </w:p>
     <w:p>
@@ -2049,17 +2200,60 @@
         <w:pStyle w:val="Heading2"/>
       </w:pPr>
       <w:r>
-        <w:t>5.4 Frontend (HTML/CSS/JS)</w:t>
+        <w:t>6.3 vector_store.py — ChromaDB Vector Store</w:t>
       </w:r>
     </w:p>
     <w:p>
       <w:r>
-        <w:t>Role: Browser-based chat interface.</w:t>
+        <w:t>Role: Manages semantic recipe search via embeddings.</w:t>
       </w:r>
     </w:p>
     <w:p>
+      <w:pPr>
+        <w:pStyle w:val="ListBullet"/>
+      </w:pPr>
       <w:r>
-        <w:t>Key features:</w:t>
+        <w:t>SentenceTransformer model loading (all-MiniLM-L6-v2)</w:t>
+      </w:r>
+    </w:p>
+    <w:p>
+      <w:pPr>
+        <w:pStyle w:val="ListBullet"/>
+      </w:pPr>
+      <w:r>
+        <w:t>Rich text document builder for recipe embedding</w:t>
+      </w:r>
+    </w:p>
+    <w:p>
+      <w:pPr>
+        <w:pStyle w:val="ListBullet"/>
+      </w:pPr>
+      <w:r>
+        <w:t>Persistent ChromaDB storage (chroma_db/ directory)</w:t>
+      </w:r>
+    </w:p>
+    <w:p>
+      <w:pPr>
+        <w:pStyle w:val="ListBullet"/>
+      </w:pPr>
+      <w:r>
+        <w:t>Batch embedding for all 25 recipes</w:t>
+      </w:r>
+    </w:p>
+    <w:p>
+      <w:pPr>
+        <w:pStyle w:val="ListBullet"/>
+      </w:pPr>
+      <w:r>
+        <w:t>Cosine similarity search with 0-100% scoring</w:t>
+      </w:r>
+    </w:p>
+    <w:p>
+      <w:pPr>
+        <w:pStyle w:val="Heading2"/>
+      </w:pPr>
+      <w:r>
+        <w:t>6.4 Frontend (HTML/CSS/JS)</w:t>
       </w:r>
     </w:p>
     <w:p>
@@ -2075,7 +2269,7 @@
         <w:pStyle w:val="ListBullet"/>
       </w:pPr>
       <w:r>
-        <w:t>Real-time typing indicators during AI processing</w:t>
+        <w:t>Real-time typing indicators</w:t>
       </w:r>
     </w:p>
     <w:p>
@@ -2083,7 +2277,7 @@
         <w:pStyle w:val="ListBullet"/>
       </w:pPr>
       <w:r>
-        <w:t>Markdown-to-HTML parser (bold, headers, lists, code)</w:t>
+        <w:t>Markdown-to-HTML rendering</w:t>
       </w:r>
     </w:p>
     <w:p>
@@ -2107,7 +2301,7 @@
         <w:pStyle w:val="ListBullet"/>
       </w:pPr>
       <w:r>
-        <w:t>Auto-resizing textarea input</w:t>
+        <w:t>Auto-resizing textarea</w:t>
       </w:r>
     </w:p>
     <w:p>
@@ -2115,7 +2309,7 @@
         <w:pStyle w:val="Heading1"/>
       </w:pPr>
       <w:r>
-        <w:t>6. API Endpoints</w:t>
+        <w:t>7. API Endpoints</w:t>
       </w:r>
     </w:p>
     <w:tbl>
@@ -2421,7 +2615,7 @@
           </w:tcPr>
           <w:p>
             <w:r>
-              <w:t>Status Code</w:t>
+              <w:t>Code</w:t>
             </w:r>
           </w:p>
         </w:tc>
@@ -2463,7 +2657,7 @@
           </w:tcPr>
           <w:p>
             <w:r>
-              <w:t>Empty message or invalid JSON</w:t>
+              <w:t>Empty message</w:t>
             </w:r>
           </w:p>
         </w:tc>
@@ -2473,7 +2667,7 @@
           </w:tcPr>
           <w:p>
             <w:r>
-              <w:t>{"error": "Empty message. Please type a question."}</w:t>
+              <w:t>{"error": "Empty message..."}</w:t>
             </w:r>
           </w:p>
         </w:tc>
@@ -2495,7 +2689,7 @@
           </w:tcPr>
           <w:p>
             <w:r>
-              <w:t>Message too long (&gt;2000 chars)</w:t>
+              <w:t>Message &gt; 2000 chars</w:t>
             </w:r>
           </w:p>
         </w:tc>
@@ -2559,7 +2753,7 @@
           </w:tcPr>
           <w:p>
             <w:r>
-              <w:t>Agent not available or LLM error</w:t>
+              <w:t>Internal error</w:t>
             </w:r>
           </w:p>
         </w:tc>
@@ -2581,7 +2775,7 @@
         <w:pStyle w:val="Heading1"/>
       </w:pPr>
       <w:r>
-        <w:t>7. Setup &amp; Installation Guide</w:t>
+        <w:t>8. Setup &amp; Installation Guide</w:t>
       </w:r>
     </w:p>
     <w:p>
@@ -2689,7 +2883,7 @@
         <w:t xml:space="preserve">Note: </w:t>
       </w:r>
       <w:r>
-        <w:t>First run downloads the all-MiniLM-L6-v2 embedding model (~80MB) and indexes recipes into ChromaDB. This is cached for subsequent runs.</w:t>
+        <w:t>First run downloads the all-MiniLM-L6-v2 embedding model (~80MB). Cached after.</w:t>
       </w:r>
     </w:p>
     <w:p>
@@ -2783,7 +2977,7 @@
         <w:pStyle w:val="Heading1"/>
       </w:pPr>
       <w:r>
-        <w:t>8. Environment Variables &amp; Configuration</w:t>
+        <w:t>9. Environment Variables &amp; Configuration</w:t>
       </w:r>
     </w:p>
     <w:tbl>
@@ -2857,7 +3051,7 @@
           </w:tcPr>
           <w:p>
             <w:r>
-              <w:t>Authenticates with Groq Cloud API for LLM inference. Get free at console.groq.com</w:t>
+              <w:t>Groq Cloud API key for LLM inference. Get free at console.groq.com</w:t>
             </w:r>
           </w:p>
         </w:tc>
@@ -2869,10 +3063,10 @@
         <w:rPr>
           <w:b/>
         </w:rPr>
-        <w:t xml:space="preserve">Security Note: </w:t>
+        <w:t xml:space="preserve">Security: </w:t>
       </w:r>
       <w:r>
-        <w:t>The .env file is explicitly listed in .gitignore to prevent API key leakage to public repositories.</w:t>
+        <w:t>.env is in .gitignore to prevent API key leakage.</w:t>
       </w:r>
     </w:p>
     <w:p>
@@ -2880,12 +3074,12 @@
         <w:pStyle w:val="Heading1"/>
       </w:pPr>
       <w:r>
-        <w:t>9. Usage Instructions &amp; Examples</w:t>
+        <w:t>10. Usage Instructions &amp; Examples</w:t>
       </w:r>
     </w:p>
     <w:p>
       <w:r>
-        <w:t>Once the server is running, open http://localhost:5000 in your browser. You can interact with the assistant in natural language.</w:t>
+        <w:t>Open http://localhost:5000 in your browser after starting the server.</w:t>
       </w:r>
     </w:p>
     <w:p>
@@ -2957,7 +3151,7 @@
           </w:tcPr>
           <w:p>
             <w:r>
-              <w:t>Hybrid (Fuzzy + Semantic)</w:t>
+              <w:t>Hybrid</w:t>
             </w:r>
           </w:p>
         </w:tc>
@@ -2967,7 +3161,7 @@
           </w:tcPr>
           <w:p>
             <w:r>
-              <w:t>Finds exact ingredient matches AND semantically related recipes</w:t>
+              <w:t>Exact ingredient + semantic matches</w:t>
             </w:r>
           </w:p>
         </w:tc>
@@ -2989,7 +3183,7 @@
           </w:tcPr>
           <w:p>
             <w:r>
-              <w:t>Semantic (ChromaDB)</w:t>
+              <w:t>Semantic</w:t>
             </w:r>
           </w:p>
         </w:tc>
@@ -3021,7 +3215,7 @@
           </w:tcPr>
           <w:p>
             <w:r>
-              <w:t>Semantic (ChromaDB)</w:t>
+              <w:t>Semantic</w:t>
             </w:r>
           </w:p>
         </w:tc>
@@ -3031,7 +3225,7 @@
           </w:tcPr>
           <w:p>
             <w:r>
-              <w:t>Finds Banana Smoothie, Mango Lassi by concept</w:t>
+              <w:t>Finds Banana Smoothie, Mango Lassi</w:t>
             </w:r>
           </w:p>
         </w:tc>
@@ -3043,7 +3237,7 @@
           </w:tcPr>
           <w:p>
             <w:r>
-              <w:t>"Show me the recipe for Butter Chicken"</w:t>
+              <w:t>"Recipe for Butter Chicken"</w:t>
             </w:r>
           </w:p>
         </w:tc>
@@ -3053,7 +3247,7 @@
           </w:tcPr>
           <w:p>
             <w:r>
-              <w:t>Fuzzy (Local KB)</w:t>
+              <w:t>Fuzzy</w:t>
             </w:r>
           </w:p>
         </w:tc>
@@ -3063,7 +3257,7 @@
           </w:tcPr>
           <w:p>
             <w:r>
-              <w:t>Returns full ingredients + step-by-step instructions</w:t>
+              <w:t>Full ingredients + step-by-step instructions</w:t>
             </w:r>
           </w:p>
         </w:tc>
@@ -3095,7 +3289,7 @@
           </w:tcPr>
           <w:p>
             <w:r>
-              <w:t>Searches local KB + TheMealDB for broad results</w:t>
+              <w:t>Local KB + TheMealDB search</w:t>
             </w:r>
           </w:p>
         </w:tc>
@@ -3117,7 +3311,7 @@
           </w:tcPr>
           <w:p>
             <w:r>
-              <w:t>List (Local KB)</w:t>
+              <w:t>List</w:t>
             </w:r>
           </w:p>
         </w:tc>
@@ -3127,7 +3321,7 @@
           </w:tcPr>
           <w:p>
             <w:r>
-              <w:t>Lists all 25 recipes grouped by category</w:t>
+              <w:t>25 recipes grouped by category</w:t>
             </w:r>
           </w:p>
         </w:tc>
@@ -3149,7 +3343,7 @@
           </w:tcPr>
           <w:p>
             <w:r>
-              <w:t>Semantic (ChromaDB)</w:t>
+              <w:t>Semantic</w:t>
             </w:r>
           </w:p>
         </w:tc>
@@ -3159,7 +3353,7 @@
           </w:tcPr>
           <w:p>
             <w:r>
-              <w:t>Finds recipes matching dietary preferences</w:t>
+              <w:t>Dietary preference matching</w:t>
             </w:r>
           </w:p>
         </w:tc>
@@ -3168,63 +3362,15 @@
     <w:p/>
     <w:p>
       <w:pPr>
-        <w:pStyle w:val="Heading2"/>
-      </w:pPr>
-      <w:r>
-        <w:t>Tips for Best Results</w:t>
-      </w:r>
-    </w:p>
-    <w:p>
-      <w:pPr>
-        <w:pStyle w:val="ListBullet"/>
-      </w:pPr>
-      <w:r>
-        <w:t>Be specific about ingredients for better fuzzy matching</w:t>
-      </w:r>
-    </w:p>
-    <w:p>
-      <w:pPr>
-        <w:pStyle w:val="ListBullet"/>
-      </w:pPr>
-      <w:r>
-        <w:t>Use descriptive phrases for semantic search ("warm comfort food")</w:t>
-      </w:r>
-    </w:p>
-    <w:p>
-      <w:pPr>
-        <w:pStyle w:val="ListBullet"/>
-      </w:pPr>
-      <w:r>
-        <w:t>Ask follow-up questions — the agent remembers your conversation</w:t>
-      </w:r>
-    </w:p>
-    <w:p>
-      <w:pPr>
-        <w:pStyle w:val="ListBullet"/>
-      </w:pPr>
-      <w:r>
-        <w:t>Click "Clear Chat" or "New Chat" to start a fresh session</w:t>
-      </w:r>
-    </w:p>
-    <w:p>
-      <w:pPr>
-        <w:pStyle w:val="ListBullet"/>
-      </w:pPr>
-      <w:r>
-        <w:t>Try the suggestion cards on the welcome screen for quick queries</w:t>
-      </w:r>
-    </w:p>
-    <w:p>
-      <w:pPr>
         <w:pStyle w:val="Heading1"/>
       </w:pPr>
       <w:r>
-        <w:t>10. Testing Strategy &amp; Coverage</w:t>
+        <w:t>11. Testing Strategy &amp; Coverage</w:t>
       </w:r>
     </w:p>
     <w:p>
       <w:r>
-        <w:t>The project includes 48 automated tests using Python's built-in unittest framework.</w:t>
+        <w:t>Run tests: python test_app.py  or  python -m pytest test_app.py -v</w:t>
       </w:r>
     </w:p>
     <w:p>
@@ -3232,28 +3378,7 @@
         <w:pStyle w:val="Heading2"/>
       </w:pPr>
       <w:r>
-        <w:t>Running Tests</w:t>
-      </w:r>
-    </w:p>
-    <w:p>
-      <w:pPr>
-        <w:pStyle w:val="NoSpacing"/>
-      </w:pPr>
-      <w:r>
-        <w:t>python test_app.py</w:t>
-      </w:r>
-    </w:p>
-    <w:p>
-      <w:r>
-        <w:t># Or with pytest:  python -m pytest test_app.py -v</w:t>
-      </w:r>
-    </w:p>
-    <w:p>
-      <w:pPr>
-        <w:pStyle w:val="Heading2"/>
-      </w:pPr>
-      <w:r>
-        <w:t>Test Coverage Breakdown (48 Tests)</w:t>
+        <w:t>48 Tests Breakdown</w:t>
       </w:r>
     </w:p>
     <w:tbl>
@@ -3327,7 +3452,7 @@
           </w:tcPr>
           <w:p>
             <w:r>
-              <w:t>JSON integrity, schema, unique IDs/names, categories</w:t>
+              <w:t>JSON integrity, schema, unique IDs/names</w:t>
             </w:r>
           </w:p>
         </w:tc>
@@ -3359,7 +3484,7 @@
           </w:tcPr>
           <w:p>
             <w:r>
-              <w:t>Exact match, case-insensitive, typos, whitespace</w:t>
+              <w:t>Exact match, case-insensitive, typos</w:t>
             </w:r>
           </w:p>
         </w:tc>
@@ -3391,7 +3516,7 @@
           </w:tcPr>
           <w:p>
             <w:r>
-              <w:t>Ingredient matching, ranking, empty inputs, result limits</w:t>
+              <w:t>Ingredient matching, ranking, limits</w:t>
             </w:r>
           </w:p>
         </w:tc>
@@ -3423,7 +3548,7 @@
           </w:tcPr>
           <w:p>
             <w:r>
-              <w:t>Full recipe retrieval, fuzzy name match, error cases</w:t>
+              <w:t>Full retrieval, fuzzy name, errors</w:t>
             </w:r>
           </w:p>
         </w:tc>
@@ -3455,7 +3580,7 @@
           </w:tcPr>
           <w:p>
             <w:r>
-              <w:t>Category grouping, completeness, count validation</w:t>
+              <w:t>Category grouping, count</w:t>
             </w:r>
           </w:p>
         </w:tc>
@@ -3467,7 +3592,7 @@
           </w:tcPr>
           <w:p>
             <w:r>
-              <w:t>Semantic Search (ChromaDB)</w:t>
+              <w:t>Semantic Search</w:t>
             </w:r>
           </w:p>
         </w:tc>
@@ -3487,7 +3612,7 @@
           </w:tcPr>
           <w:p>
             <w:r>
-              <w:t>Vector store init, descriptive queries, dietary queries, similarity scores</w:t>
+              <w:t>ChromaDB init, descriptive/dietary queries</w:t>
             </w:r>
           </w:p>
         </w:tc>
@@ -3519,7 +3644,7 @@
           </w:tcPr>
           <w:p>
             <w:r>
-              <w:t>Combined results, deduplication, query-only mode, method labels</w:t>
+              <w:t>Combined results, dedup, method labels</w:t>
             </w:r>
           </w:p>
         </w:tc>
@@ -3551,7 +3676,7 @@
           </w:tcPr>
           <w:p>
             <w:r>
-              <w:t>7 tools registered, schema structure, TOOL_MAP completeness</w:t>
+              <w:t>7 tools, schema, TOOL_MAP</w:t>
             </w:r>
           </w:p>
         </w:tc>
@@ -3583,7 +3708,7 @@
           </w:tcPr>
           <w:p>
             <w:r>
-              <w:t>Online search, empty inputs, unknown meals, error handling</w:t>
+              <w:t>Online search, errors</w:t>
             </w:r>
           </w:p>
         </w:tc>
@@ -3615,7 +3740,7 @@
           </w:tcPr>
           <w:p>
             <w:r>
-              <w:t>Routes, status codes, JSON validation, session clearing</w:t>
+              <w:t>Routes, status codes, sessions</w:t>
             </w:r>
           </w:p>
         </w:tc>
@@ -3627,7 +3752,7 @@
         <w:pStyle w:val="Heading1"/>
       </w:pPr>
       <w:r>
-        <w:t>11. User Flows &amp; Use Cases</w:t>
+        <w:t>12. User Flows &amp; Use Cases</w:t>
       </w:r>
     </w:p>
     <w:p>
@@ -3651,7 +3776,7 @@
         <w:pStyle w:val="ListNumber"/>
       </w:pPr>
       <w:r>
-        <w:t>Agent calls search_recipes_hybrid with query + ingredients list</w:t>
+        <w:t>Agent calls search_recipes_hybrid with query + ingredients</w:t>
       </w:r>
     </w:p>
     <w:p>
@@ -3659,7 +3784,7 @@
         <w:pStyle w:val="ListNumber"/>
       </w:pPr>
       <w:r>
-        <w:t>Fuzzy layer finds Chicken Fried Rice (33% match), Caesar Salad, etc.</w:t>
+        <w:t>Fuzzy: finds Chicken Fried Rice, Caesar Salad by ingredient match</w:t>
       </w:r>
     </w:p>
     <w:p>
@@ -3667,7 +3792,7 @@
         <w:pStyle w:val="ListNumber"/>
       </w:pPr>
       <w:r>
-        <w:t>Semantic layer finds Chicken Biryani, Butter Chicken by meaning</w:t>
+        <w:t>Semantic: finds Chicken Biryani, Butter Chicken by meaning</w:t>
       </w:r>
     </w:p>
     <w:p>
@@ -3675,7 +3800,7 @@
         <w:pStyle w:val="ListNumber"/>
       </w:pPr>
       <w:r>
-        <w:t>Results merged, deduplicated, and presented to user</w:t>
+        <w:t>Results merged, deduplicated, presented</w:t>
       </w:r>
     </w:p>
     <w:p>
@@ -3683,7 +3808,7 @@
         <w:pStyle w:val="ListNumber"/>
       </w:pPr>
       <w:r>
-        <w:t>User asks for details → Agent calls get_recipe_details_local</w:t>
+        <w:t>User asks for details</w:t>
       </w:r>
     </w:p>
     <w:p>
@@ -3699,7 +3824,7 @@
         <w:pStyle w:val="ListNumber"/>
       </w:pPr>
       <w:r>
-        <w:t>User types: "I want something warm and comforting for dinner"</w:t>
+        <w:t>User types: "I want something warm and comforting"</w:t>
       </w:r>
     </w:p>
     <w:p>
@@ -3707,7 +3832,7 @@
         <w:pStyle w:val="ListNumber"/>
       </w:pPr>
       <w:r>
-        <w:t>Agent calls search_recipes_semantic with the descriptive query</w:t>
+        <w:t>Agent calls search_recipes_semantic</w:t>
       </w:r>
     </w:p>
     <w:p>
@@ -3715,7 +3840,7 @@
         <w:pStyle w:val="ListNumber"/>
       </w:pPr>
       <w:r>
-        <w:t>ChromaDB returns semantically similar recipes (Dal Tadka, Butter Chicken, Tomato Soup)</w:t>
+        <w:t>ChromaDB returns: Dal Tadka, Butter Chicken, Tomato Soup</w:t>
       </w:r>
     </w:p>
     <w:p>
@@ -3723,7 +3848,7 @@
         <w:pStyle w:val="ListNumber"/>
       </w:pPr>
       <w:r>
-        <w:t>Agent presents options with similarity scores</w:t>
+        <w:t>Agent presents with similarity scores</w:t>
       </w:r>
     </w:p>
     <w:p>
@@ -3739,7 +3864,7 @@
         <w:pStyle w:val="ListNumber"/>
       </w:pPr>
       <w:r>
-        <w:t>User types: "Show me all your recipes"</w:t>
+        <w:t>User types: "Show me all recipes"</w:t>
       </w:r>
     </w:p>
     <w:p>
@@ -3755,7 +3880,7 @@
         <w:pStyle w:val="ListNumber"/>
       </w:pPr>
       <w:r>
-        <w:t>Returns 25 recipes organized by category (Breakfast, Lunch, Dinner, Snack, Dessert)</w:t>
+        <w:t>25 recipes by category (Breakfast, Lunch, Dinner, Snack, Dessert)</w:t>
       </w:r>
     </w:p>
     <w:p>
@@ -3763,7 +3888,7 @@
         <w:pStyle w:val="ListNumber"/>
       </w:pPr>
       <w:r>
-        <w:t>User picks one → Agent fetches full details</w:t>
+        <w:t>User picks one, agent fetches full details</w:t>
       </w:r>
     </w:p>
     <w:p>
@@ -3771,12 +3896,7 @@
         <w:pStyle w:val="Heading1"/>
       </w:pPr>
       <w:r>
-        <w:t>12. Knowledge Base Schema</w:t>
-      </w:r>
-    </w:p>
-    <w:p>
-      <w:r>
-        <w:t>The local knowledge base uses a structured JSON format. Each recipe contains:</w:t>
+        <w:t>13. Knowledge Base Schema</w:t>
       </w:r>
     </w:p>
     <w:tbl>
@@ -3882,7 +4002,7 @@
           </w:tcPr>
           <w:p>
             <w:r>
-              <w:t>Recipe name (e.g., "Butter Chicken")</w:t>
+              <w:t>Recipe name</w:t>
             </w:r>
           </w:p>
         </w:tc>
@@ -3914,7 +4034,7 @@
           </w:tcPr>
           <w:p>
             <w:r>
-              <w:t>Breakfast, Lunch, Dinner, Snack, or Dessert</w:t>
+              <w:t>Breakfast/Lunch/Dinner/Snack/Dessert</w:t>
             </w:r>
           </w:p>
         </w:tc>
@@ -3946,7 +4066,7 @@
           </w:tcPr>
           <w:p>
             <w:r>
-              <w:t>Indian, Italian, Mexican, Chinese, etc.</w:t>
+              <w:t>Indian, Italian, Mexican, etc.</w:t>
             </w:r>
           </w:p>
         </w:tc>
@@ -3990,7 +4110,7 @@
           </w:tcPr>
           <w:p>
             <w:r>
-              <w:t>prep_time</w:t>
+              <w:t>prep_time / cook_time</w:t>
             </w:r>
           </w:p>
         </w:tc>
@@ -4010,7 +4130,7 @@
           </w:tcPr>
           <w:p>
             <w:r>
-              <w:t>Preparation time (e.g., "15 min")</w:t>
+              <w:t>Time estimates</w:t>
             </w:r>
           </w:p>
         </w:tc>
@@ -4022,7 +4142,7 @@
           </w:tcPr>
           <w:p>
             <w:r>
-              <w:t>cook_time</w:t>
+              <w:t>servings</w:t>
             </w:r>
           </w:p>
         </w:tc>
@@ -4032,7 +4152,7 @@
           </w:tcPr>
           <w:p>
             <w:r>
-              <w:t>String</w:t>
+              <w:t>Integer</w:t>
             </w:r>
           </w:p>
         </w:tc>
@@ -4042,7 +4162,7 @@
           </w:tcPr>
           <w:p>
             <w:r>
-              <w:t>Cooking time (e.g., "30 min")</w:t>
+              <w:t>Number of servings</w:t>
             </w:r>
           </w:p>
         </w:tc>
@@ -4054,7 +4174,7 @@
           </w:tcPr>
           <w:p>
             <w:r>
-              <w:t>servings</w:t>
+              <w:t>dietary_tags</w:t>
             </w:r>
           </w:p>
         </w:tc>
@@ -4064,7 +4184,7 @@
           </w:tcPr>
           <w:p>
             <w:r>
-              <w:t>Integer</w:t>
+              <w:t>Array</w:t>
             </w:r>
           </w:p>
         </w:tc>
@@ -4074,7 +4194,7 @@
           </w:tcPr>
           <w:p>
             <w:r>
-              <w:t>Number of servings</w:t>
+              <w:t>["vegetarian", "vegan", "gluten-free"]</w:t>
             </w:r>
           </w:p>
         </w:tc>
@@ -4086,7 +4206,7 @@
           </w:tcPr>
           <w:p>
             <w:r>
-              <w:t>dietary_tags</w:t>
+              <w:t>ingredients</w:t>
             </w:r>
           </w:p>
         </w:tc>
@@ -4106,7 +4226,7 @@
           </w:tcPr>
           <w:p>
             <w:r>
-              <w:t>e.g., ["vegetarian", "gluten-free"]</w:t>
+              <w:t>Objects with "name" and "qty"</w:t>
             </w:r>
           </w:p>
         </w:tc>
@@ -4118,7 +4238,7 @@
           </w:tcPr>
           <w:p>
             <w:r>
-              <w:t>ingredients</w:t>
+              <w:t>instructions</w:t>
             </w:r>
           </w:p>
         </w:tc>
@@ -4138,39 +4258,7 @@
           </w:tcPr>
           <w:p>
             <w:r>
-              <w:t>Objects with "name" and "qty" fields</w:t>
-            </w:r>
-          </w:p>
-        </w:tc>
-      </w:tr>
-      <w:tr>
-        <w:tc>
-          <w:tcPr>
-            <w:tcW w:type="dxa" w:w="2880"/>
-          </w:tcPr>
-          <w:p>
-            <w:r>
-              <w:t>instructions</w:t>
-            </w:r>
-          </w:p>
-        </w:tc>
-        <w:tc>
-          <w:tcPr>
-            <w:tcW w:type="dxa" w:w="2880"/>
-          </w:tcPr>
-          <w:p>
-            <w:r>
-              <w:t>Array</w:t>
-            </w:r>
-          </w:p>
-        </w:tc>
-        <w:tc>
-          <w:tcPr>
-            <w:tcW w:type="dxa" w:w="2880"/>
-          </w:tcPr>
-          <w:p>
-            <w:r>
-              <w:t>Ordered list of cooking steps</w:t>
+              <w:t>Ordered cooking steps</w:t>
             </w:r>
           </w:p>
         </w:tc>
@@ -4182,7 +4270,7 @@
         <w:pStyle w:val="Heading2"/>
       </w:pPr>
       <w:r>
-        <w:t>Local KB Coverage</w:t>
+        <w:t>Coverage</w:t>
       </w:r>
     </w:p>
     <w:tbl>
@@ -4269,7 +4357,7 @@
           </w:tcPr>
           <w:p>
             <w:r>
-              <w:t>Dietary Tags</w:t>
+              <w:t>Total</w:t>
             </w:r>
           </w:p>
         </w:tc>
@@ -4279,29 +4367,7 @@
           </w:tcPr>
           <w:p>
             <w:r>
-              <w:t>vegetarian, vegan, gluten-free</w:t>
-            </w:r>
-          </w:p>
-        </w:tc>
-      </w:tr>
-      <w:tr>
-        <w:tc>
-          <w:tcPr>
-            <w:tcW w:type="dxa" w:w="4320"/>
-          </w:tcPr>
-          <w:p>
-            <w:r>
-              <w:t>Total Recipes</w:t>
-            </w:r>
-          </w:p>
-        </w:tc>
-        <w:tc>
-          <w:tcPr>
-            <w:tcW w:type="dxa" w:w="4320"/>
-          </w:tcPr>
-          <w:p>
-            <w:r>
-              <w:t>25</w:t>
+              <w:t>25 curated recipes</w:t>
             </w:r>
           </w:p>
         </w:tc>
@@ -4313,7 +4379,7 @@
         <w:pStyle w:val="Heading1"/>
       </w:pPr>
       <w:r>
-        <w:t>13. Technology Stack</w:t>
+        <w:t>14. Technology Stack</w:t>
       </w:r>
     </w:p>
     <w:tbl>
@@ -4387,7 +4453,7 @@
           </w:tcPr>
           <w:p>
             <w:r>
-              <w:t>REST API server, routing, session management</w:t>
+              <w:t>REST API, session management</w:t>
             </w:r>
           </w:p>
         </w:tc>
@@ -4409,7 +4475,7 @@
           </w:tcPr>
           <w:p>
             <w:r>
-              <w:t>Groq API (llama-3.3-70b-versatile)</w:t>
+              <w:t>Groq API (llama-3.3-70b)</w:t>
             </w:r>
           </w:p>
         </w:tc>
@@ -4419,7 +4485,7 @@
           </w:tcPr>
           <w:p>
             <w:r>
-              <w:t>Natural language understanding and tool-calling</w:t>
+              <w:t>NLU and tool-calling</w:t>
             </w:r>
           </w:p>
         </w:tc>
@@ -4431,7 +4497,7 @@
           </w:tcPr>
           <w:p>
             <w:r>
-              <w:t>Vector Database</w:t>
+              <w:t>Vector DB</w:t>
             </w:r>
           </w:p>
         </w:tc>
@@ -4451,7 +4517,7 @@
           </w:tcPr>
           <w:p>
             <w:r>
-              <w:t>Persistent local vector storage for semantic search</w:t>
+              <w:t>Semantic search storage</w:t>
             </w:r>
           </w:p>
         </w:tc>
@@ -4473,7 +4539,7 @@
           </w:tcPr>
           <w:p>
             <w:r>
-              <w:t>Sentence Transformers (all-MiniLM-L6-v2)</w:t>
+              <w:t>SentenceTransformers (all-MiniLM-L6-v2)</w:t>
             </w:r>
           </w:p>
         </w:tc>
@@ -4483,7 +4549,7 @@
           </w:tcPr>
           <w:p>
             <w:r>
-              <w:t>384-dimensional text embeddings for similarity search</w:t>
+              <w:t>384-dim text embeddings</w:t>
             </w:r>
           </w:p>
         </w:tc>
@@ -4515,7 +4581,7 @@
           </w:tcPr>
           <w:p>
             <w:r>
-              <w:t>Free online recipe database (300+ recipes)</w:t>
+              <w:t>Online recipe database</w:t>
             </w:r>
           </w:p>
         </w:tc>
@@ -4547,7 +4613,7 @@
           </w:tcPr>
           <w:p>
             <w:r>
-              <w:t>Chat interface, markdown rendering, responsive design</w:t>
+              <w:t>Chat UI</w:t>
             </w:r>
           </w:p>
         </w:tc>
@@ -4569,7 +4635,7 @@
           </w:tcPr>
           <w:p>
             <w:r>
-              <w:t>unittest</w:t>
+              <w:t>unittest (48 tests)</w:t>
             </w:r>
           </w:p>
         </w:tc>
@@ -4579,7 +4645,7 @@
           </w:tcPr>
           <w:p>
             <w:r>
-              <w:t>48 automated tests covering all components</w:t>
+              <w:t>Automated testing</w:t>
             </w:r>
           </w:p>
         </w:tc>
@@ -4591,7 +4657,7 @@
           </w:tcPr>
           <w:p>
             <w:r>
-              <w:t>Version Control</w:t>
+              <w:t>VCS</w:t>
             </w:r>
           </w:p>
         </w:tc>
@@ -4611,7 +4677,7 @@
           </w:tcPr>
           <w:p>
             <w:r>
-              <w:t>Source code management and collaboration</w:t>
+              <w:t>Version control</w:t>
             </w:r>
           </w:p>
         </w:tc>
@@ -4697,7 +4763,7 @@
           </w:tcPr>
           <w:p>
             <w:r>
-              <w:t>Groq Cloud API SDK for LLM inference</w:t>
+              <w:t>Groq LLM API SDK</w:t>
             </w:r>
           </w:p>
         </w:tc>
@@ -4729,7 +4795,7 @@
           </w:tcPr>
           <w:p>
             <w:r>
-              <w:t>Web framework for REST API and HTML serving</w:t>
+              <w:t>Web framework</w:t>
             </w:r>
           </w:p>
         </w:tc>
@@ -4761,7 +4827,7 @@
           </w:tcPr>
           <w:p>
             <w:r>
-              <w:t>Load .env file for API key management</w:t>
+              <w:t>.env file loader</w:t>
             </w:r>
           </w:p>
         </w:tc>
@@ -4793,7 +4859,7 @@
           </w:tcPr>
           <w:p>
             <w:r>
-              <w:t>HTTP client for TheMealDB API calls</w:t>
+              <w:t>HTTP client (TheMealDB)</w:t>
             </w:r>
           </w:p>
         </w:tc>
@@ -4825,7 +4891,7 @@
           </w:tcPr>
           <w:p>
             <w:r>
-              <w:t>Vector database for semantic recipe search</w:t>
+              <w:t>Vector database</w:t>
             </w:r>
           </w:p>
         </w:tc>
@@ -4857,7 +4923,7 @@
           </w:tcPr>
           <w:p>
             <w:r>
-              <w:t>Pre-trained embedding models for text vectorization</w:t>
+              <w:t>Embedding models</w:t>
             </w:r>
           </w:p>
         </w:tc>

</xml_diff>